<commit_message>
docs: Spec v0.4 ch.10-11 (license, i18n), ToS + Privacy drafts, landing copy
</commit_message>
<xml_diff>
--- a/docs/Sotto_Spec_v0.4.docx
+++ b/docs/Sotto_Spec_v0.4.docx
@@ -8612,6 +8612,4094 @@
         <w:t xml:space="preserve">Stripe Connect の事前申請（Phase 2.5 に向けて）</w:t>
       </w:r>
     </w:p>
+    <w:p>
+      <w:r>
+        <w:br w:type="page"/>
+      </w:r>
+    </w:p>
+    <w:p>
+      <w:pPr>
+        <w:pStyle w:val="Heading1"/>
+        <w:spacing w:after="200" w:before="360"/>
+      </w:pPr>
+      <w:r>
+        <w:rPr>
+          <w:rFonts w:ascii="Noto Serif JP" w:cs="Noto Serif JP" w:eastAsia="Noto Serif JP" w:hAnsi="Noto Serif JP"/>
+          <w:b/>
+          <w:bCs/>
+          <w:color w:val="1A1A1A"/>
+          <w:sz w:val="32"/>
+          <w:szCs w:val="32"/>
+        </w:rPr>
+        <w:t xml:space="preserve">10. ライセンス・著作権設計</w:t>
+      </w:r>
+    </w:p>
+    <w:p>
+      <w:pPr>
+        <w:pBdr>
+          <w:left w:val="single" w:color="B8945C" w:sz="12" w:space="12"/>
+        </w:pBdr>
+        <w:spacing w:after="120" w:before="120"/>
+        <w:ind w:left="480" w:right="480"/>
+      </w:pPr>
+      <w:r>
+        <w:rPr>
+          <w:rFonts w:ascii="Noto Serif JP" w:cs="Noto Serif JP" w:eastAsia="Noto Serif JP" w:hAnsi="Noto Serif JP"/>
+          <w:i/>
+          <w:iCs/>
+          <w:color w:val="6E6859"/>
+          <w:sz w:val="22"/>
+          <w:szCs w:val="22"/>
+        </w:rPr>
+        <w:t xml:space="preserve">AI音楽を、店舗で安心して流せる場所。 — これが Sotto. の差別化の核。ライセンス保証はブランドの一部である。</w:t>
+      </w:r>
+    </w:p>
+    <w:p>
+      <w:pPr>
+        <w:pStyle w:val="Heading2"/>
+        <w:spacing w:after="140" w:before="280"/>
+      </w:pPr>
+      <w:r>
+        <w:rPr>
+          <w:rFonts w:ascii="Noto Serif JP" w:cs="Noto Serif JP" w:eastAsia="Noto Serif JP" w:hAnsi="Noto Serif JP"/>
+          <w:b/>
+          <w:bCs/>
+          <w:color w:val="1A1A1A"/>
+          <w:sz w:val="26"/>
+          <w:szCs w:val="26"/>
+        </w:rPr>
+        <w:t xml:space="preserve">10.1 設計の基本方針</w:t>
+      </w:r>
+    </w:p>
+    <w:p>
+      <w:pPr>
+        <w:spacing w:after="60" w:before="60"/>
+      </w:pPr>
+      <w:r>
+        <w:rPr>
+          <w:rFonts w:ascii="Noto Serif JP" w:cs="Noto Serif JP" w:eastAsia="Noto Serif JP" w:hAnsi="Noto Serif JP"/>
+          <w:b w:val="false"/>
+          <w:bCs w:val="false"/>
+          <w:i w:val="false"/>
+          <w:iCs w:val="false"/>
+          <w:color w:val="1A1A1A"/>
+          <w:sz w:val="22"/>
+          <w:szCs w:val="22"/>
+        </w:rPr>
+        <w:t xml:space="preserve">Sotto. は単なる「投稿サービス」ではなく、店舗が商用利用する音楽の流通基盤になる。したがって、著作権処理は「ユーザー責任」だけでは不十分で、Sotto. が間に立って一定の保証を提供する構造を持つ。</w:t>
+      </w:r>
+    </w:p>
+    <w:p>
+      <w:pPr>
+        <w:spacing w:after="60" w:before="60"/>
+      </w:pPr>
+      <w:r>
+        <w:rPr>
+          <w:rFonts w:ascii="Noto Serif JP" w:cs="Noto Serif JP" w:eastAsia="Noto Serif JP" w:hAnsi="Noto Serif JP"/>
+          <w:b w:val="false"/>
+          <w:bCs w:val="false"/>
+          <w:i w:val="false"/>
+          <w:iCs w:val="false"/>
+          <w:color w:val="1A1A1A"/>
+          <w:sz w:val="22"/>
+          <w:szCs w:val="22"/>
+        </w:rPr>
+        <w:t xml:space="preserve"/>
+      </w:r>
+    </w:p>
+    <w:tbl>
+      <w:tblPr>
+        <w:tblW w:type="dxa" w:w="9300"/>
+        <w:tblBorders>
+          <w:top w:val="single" w:color="auto" w:sz="4"/>
+          <w:left w:val="single" w:color="auto" w:sz="4"/>
+          <w:bottom w:val="single" w:color="auto" w:sz="4"/>
+          <w:right w:val="single" w:color="auto" w:sz="4"/>
+          <w:insideH w:val="single" w:color="auto" w:sz="4"/>
+          <w:insideV w:val="single" w:color="auto" w:sz="4"/>
+        </w:tblBorders>
+      </w:tblPr>
+      <w:tblGrid>
+        <w:gridCol w:w="2400"/>
+        <w:gridCol w:w="6900"/>
+      </w:tblGrid>
+      <w:tr>
+        <w:tc>
+          <w:tcPr>
+            <w:tcW w:type="dxa" w:w="2400"/>
+            <w:tcBorders>
+              <w:top w:val="single" w:color="D8D2C6" w:sz="4"/>
+              <w:left w:val="single" w:color="D8D2C6" w:sz="4"/>
+              <w:bottom w:val="single" w:color="D8D2C6" w:sz="4"/>
+              <w:right w:val="single" w:color="D8D2C6" w:sz="4"/>
+            </w:tcBorders>
+            <w:shd w:fill="FAF5EB" w:val="clear"/>
+            <w:tcMar>
+              <w:top w:type="dxa" w:w="90"/>
+              <w:left w:type="dxa" w:w="130"/>
+              <w:bottom w:type="dxa" w:w="90"/>
+              <w:right w:type="dxa" w:w="130"/>
+            </w:tcMar>
+          </w:tcPr>
+          <w:p>
+            <w:pPr>
+              <w:spacing w:after="0" w:before="0"/>
+            </w:pPr>
+            <w:r>
+              <w:rPr>
+                <w:rFonts w:ascii="Noto Serif JP" w:cs="Noto Serif JP" w:eastAsia="Noto Serif JP" w:hAnsi="Noto Serif JP"/>
+                <w:b/>
+                <w:bCs/>
+                <w:color w:val="1A1A1A"/>
+                <w:sz w:val="20"/>
+                <w:szCs w:val="20"/>
+              </w:rPr>
+              <w:t xml:space="preserve">基本方針</w:t>
+            </w:r>
+          </w:p>
+        </w:tc>
+        <w:tc>
+          <w:tcPr>
+            <w:tcW w:type="dxa" w:w="6900"/>
+            <w:tcBorders>
+              <w:top w:val="single" w:color="D8D2C6" w:sz="4"/>
+              <w:left w:val="single" w:color="D8D2C6" w:sz="4"/>
+              <w:bottom w:val="single" w:color="D8D2C6" w:sz="4"/>
+              <w:right w:val="single" w:color="D8D2C6" w:sz="4"/>
+            </w:tcBorders>
+            <w:shd w:fill="FAF5EB" w:val="clear"/>
+            <w:tcMar>
+              <w:top w:type="dxa" w:w="90"/>
+              <w:left w:type="dxa" w:w="130"/>
+              <w:bottom w:type="dxa" w:w="90"/>
+              <w:right w:type="dxa" w:w="130"/>
+            </w:tcMar>
+          </w:tcPr>
+          <w:p>
+            <w:pPr>
+              <w:spacing w:after="0" w:before="0"/>
+            </w:pPr>
+            <w:r>
+              <w:rPr>
+                <w:rFonts w:ascii="Noto Serif JP" w:cs="Noto Serif JP" w:eastAsia="Noto Serif JP" w:hAnsi="Noto Serif JP"/>
+                <w:b/>
+                <w:bCs/>
+                <w:color w:val="1A1A1A"/>
+                <w:sz w:val="20"/>
+                <w:szCs w:val="20"/>
+              </w:rPr>
+              <w:t xml:space="preserve">詳細</w:t>
+            </w:r>
+          </w:p>
+        </w:tc>
+      </w:tr>
+      <w:tr>
+        <w:tc>
+          <w:tcPr>
+            <w:tcW w:type="dxa" w:w="2400"/>
+            <w:tcBorders>
+              <w:top w:val="single" w:color="D8D2C6" w:sz="4"/>
+              <w:left w:val="single" w:color="D8D2C6" w:sz="4"/>
+              <w:bottom w:val="single" w:color="D8D2C6" w:sz="4"/>
+              <w:right w:val="single" w:color="D8D2C6" w:sz="4"/>
+            </w:tcBorders>
+            <w:shd w:fill="F4F1EC" w:val="clear"/>
+            <w:tcMar>
+              <w:top w:type="dxa" w:w="90"/>
+              <w:left w:type="dxa" w:w="130"/>
+              <w:bottom w:type="dxa" w:w="90"/>
+              <w:right w:type="dxa" w:w="130"/>
+            </w:tcMar>
+          </w:tcPr>
+          <w:p>
+            <w:pPr>
+              <w:spacing w:after="0" w:before="0"/>
+            </w:pPr>
+            <w:r>
+              <w:rPr>
+                <w:rFonts w:ascii="Noto Serif JP" w:cs="Noto Serif JP" w:eastAsia="Noto Serif JP" w:hAnsi="Noto Serif JP"/>
+                <w:b/>
+                <w:bCs/>
+                <w:color w:val="1A1A1A"/>
+                <w:sz w:val="20"/>
+                <w:szCs w:val="20"/>
+              </w:rPr>
+              <w:t xml:space="preserve">① クリエイター責任</w:t>
+            </w:r>
+          </w:p>
+        </w:tc>
+        <w:tc>
+          <w:tcPr>
+            <w:tcW w:type="dxa" w:w="6900"/>
+            <w:tcBorders>
+              <w:top w:val="single" w:color="D8D2C6" w:sz="4"/>
+              <w:left w:val="single" w:color="D8D2C6" w:sz="4"/>
+              <w:bottom w:val="single" w:color="D8D2C6" w:sz="4"/>
+              <w:right w:val="single" w:color="D8D2C6" w:sz="4"/>
+            </w:tcBorders>
+            <w:tcMar>
+              <w:top w:type="dxa" w:w="90"/>
+              <w:left w:type="dxa" w:w="130"/>
+              <w:bottom w:type="dxa" w:w="90"/>
+              <w:right w:type="dxa" w:w="130"/>
+            </w:tcMar>
+          </w:tcPr>
+          <w:p>
+            <w:pPr>
+              <w:spacing w:after="0" w:before="0"/>
+            </w:pPr>
+            <w:r>
+              <w:rPr>
+                <w:rFonts w:ascii="Noto Serif JP" w:cs="Noto Serif JP" w:eastAsia="Noto Serif JP" w:hAnsi="Noto Serif JP"/>
+                <w:b w:val="false"/>
+                <w:bCs w:val="false"/>
+                <w:color w:val="1A1A1A"/>
+                <w:sz w:val="20"/>
+                <w:szCs w:val="20"/>
+              </w:rPr>
+              <w:t xml:space="preserve">投稿時に、AIツールの商用利用ライセンスを所持していることを保証する。</w:t>
+            </w:r>
+          </w:p>
+        </w:tc>
+      </w:tr>
+      <w:tr>
+        <w:tc>
+          <w:tcPr>
+            <w:tcW w:type="dxa" w:w="2400"/>
+            <w:tcBorders>
+              <w:top w:val="single" w:color="D8D2C6" w:sz="4"/>
+              <w:left w:val="single" w:color="D8D2C6" w:sz="4"/>
+              <w:bottom w:val="single" w:color="D8D2C6" w:sz="4"/>
+              <w:right w:val="single" w:color="D8D2C6" w:sz="4"/>
+            </w:tcBorders>
+            <w:shd w:fill="F4F1EC" w:val="clear"/>
+            <w:tcMar>
+              <w:top w:type="dxa" w:w="90"/>
+              <w:left w:type="dxa" w:w="130"/>
+              <w:bottom w:type="dxa" w:w="90"/>
+              <w:right w:type="dxa" w:w="130"/>
+            </w:tcMar>
+          </w:tcPr>
+          <w:p>
+            <w:pPr>
+              <w:spacing w:after="0" w:before="0"/>
+            </w:pPr>
+            <w:r>
+              <w:rPr>
+                <w:rFonts w:ascii="Noto Serif JP" w:cs="Noto Serif JP" w:eastAsia="Noto Serif JP" w:hAnsi="Noto Serif JP"/>
+                <w:b/>
+                <w:bCs/>
+                <w:color w:val="1A1A1A"/>
+                <w:sz w:val="20"/>
+                <w:szCs w:val="20"/>
+              </w:rPr>
+              <w:t xml:space="preserve">② Sotto. への許諾</w:t>
+            </w:r>
+          </w:p>
+        </w:tc>
+        <w:tc>
+          <w:tcPr>
+            <w:tcW w:type="dxa" w:w="6900"/>
+            <w:tcBorders>
+              <w:top w:val="single" w:color="D8D2C6" w:sz="4"/>
+              <w:left w:val="single" w:color="D8D2C6" w:sz="4"/>
+              <w:bottom w:val="single" w:color="D8D2C6" w:sz="4"/>
+              <w:right w:val="single" w:color="D8D2C6" w:sz="4"/>
+            </w:tcBorders>
+            <w:tcMar>
+              <w:top w:type="dxa" w:w="90"/>
+              <w:left w:type="dxa" w:w="130"/>
+              <w:bottom w:type="dxa" w:w="90"/>
+              <w:right w:type="dxa" w:w="130"/>
+            </w:tcMar>
+          </w:tcPr>
+          <w:p>
+            <w:pPr>
+              <w:spacing w:after="0" w:before="0"/>
+            </w:pPr>
+            <w:r>
+              <w:rPr>
+                <w:rFonts w:ascii="Noto Serif JP" w:cs="Noto Serif JP" w:eastAsia="Noto Serif JP" w:hAnsi="Noto Serif JP"/>
+                <w:b w:val="false"/>
+                <w:bCs w:val="false"/>
+                <w:color w:val="1A1A1A"/>
+                <w:sz w:val="20"/>
+                <w:szCs w:val="20"/>
+              </w:rPr>
+              <w:t xml:space="preserve">投稿者は Sotto. に対し、表示・配信・サムネ生成・OGP・プロモーション等の非独占的利用を許諾する。</w:t>
+            </w:r>
+          </w:p>
+        </w:tc>
+      </w:tr>
+      <w:tr>
+        <w:tc>
+          <w:tcPr>
+            <w:tcW w:type="dxa" w:w="2400"/>
+            <w:tcBorders>
+              <w:top w:val="single" w:color="D8D2C6" w:sz="4"/>
+              <w:left w:val="single" w:color="D8D2C6" w:sz="4"/>
+              <w:bottom w:val="single" w:color="D8D2C6" w:sz="4"/>
+              <w:right w:val="single" w:color="D8D2C6" w:sz="4"/>
+            </w:tcBorders>
+            <w:shd w:fill="F4F1EC" w:val="clear"/>
+            <w:tcMar>
+              <w:top w:type="dxa" w:w="90"/>
+              <w:left w:type="dxa" w:w="130"/>
+              <w:bottom w:type="dxa" w:w="90"/>
+              <w:right w:type="dxa" w:w="130"/>
+            </w:tcMar>
+          </w:tcPr>
+          <w:p>
+            <w:pPr>
+              <w:spacing w:after="0" w:before="0"/>
+            </w:pPr>
+            <w:r>
+              <w:rPr>
+                <w:rFonts w:ascii="Noto Serif JP" w:cs="Noto Serif JP" w:eastAsia="Noto Serif JP" w:hAnsi="Noto Serif JP"/>
+                <w:b/>
+                <w:bCs/>
+                <w:color w:val="1A1A1A"/>
+                <w:sz w:val="20"/>
+                <w:szCs w:val="20"/>
+              </w:rPr>
+              <w:t xml:space="preserve">③ Spaces 採用時のライセンス</w:t>
+            </w:r>
+          </w:p>
+        </w:tc>
+        <w:tc>
+          <w:tcPr>
+            <w:tcW w:type="dxa" w:w="6900"/>
+            <w:tcBorders>
+              <w:top w:val="single" w:color="D8D2C6" w:sz="4"/>
+              <w:left w:val="single" w:color="D8D2C6" w:sz="4"/>
+              <w:bottom w:val="single" w:color="D8D2C6" w:sz="4"/>
+              <w:right w:val="single" w:color="D8D2C6" w:sz="4"/>
+            </w:tcBorders>
+            <w:tcMar>
+              <w:top w:type="dxa" w:w="90"/>
+              <w:left w:type="dxa" w:w="130"/>
+              <w:bottom w:type="dxa" w:w="90"/>
+              <w:right w:type="dxa" w:w="130"/>
+            </w:tcMar>
+          </w:tcPr>
+          <w:p>
+            <w:pPr>
+              <w:spacing w:after="0" w:before="0"/>
+            </w:pPr>
+            <w:r>
+              <w:rPr>
+                <w:rFonts w:ascii="Noto Serif JP" w:cs="Noto Serif JP" w:eastAsia="Noto Serif JP" w:hAnsi="Noto Serif JP"/>
+                <w:b w:val="false"/>
+                <w:bCs w:val="false"/>
+                <w:color w:val="1A1A1A"/>
+                <w:sz w:val="20"/>
+                <w:szCs w:val="20"/>
+              </w:rPr>
+              <w:t xml:space="preserve">店舗が Premium 契約すれば、契約範囲内の商用利用が許諾される。クリエイターには採用ごとにロイヤリティ支払い。</w:t>
+            </w:r>
+          </w:p>
+        </w:tc>
+      </w:tr>
+      <w:tr>
+        <w:tc>
+          <w:tcPr>
+            <w:tcW w:type="dxa" w:w="2400"/>
+            <w:tcBorders>
+              <w:top w:val="single" w:color="D8D2C6" w:sz="4"/>
+              <w:left w:val="single" w:color="D8D2C6" w:sz="4"/>
+              <w:bottom w:val="single" w:color="D8D2C6" w:sz="4"/>
+              <w:right w:val="single" w:color="D8D2C6" w:sz="4"/>
+            </w:tcBorders>
+            <w:shd w:fill="F4F1EC" w:val="clear"/>
+            <w:tcMar>
+              <w:top w:type="dxa" w:w="90"/>
+              <w:left w:type="dxa" w:w="130"/>
+              <w:bottom w:type="dxa" w:w="90"/>
+              <w:right w:type="dxa" w:w="130"/>
+            </w:tcMar>
+          </w:tcPr>
+          <w:p>
+            <w:pPr>
+              <w:spacing w:after="0" w:before="0"/>
+            </w:pPr>
+            <w:r>
+              <w:rPr>
+                <w:rFonts w:ascii="Noto Serif JP" w:cs="Noto Serif JP" w:eastAsia="Noto Serif JP" w:hAnsi="Noto Serif JP"/>
+                <w:b/>
+                <w:bCs/>
+                <w:color w:val="1A1A1A"/>
+                <w:sz w:val="20"/>
+                <w:szCs w:val="20"/>
+              </w:rPr>
+              <w:t xml:space="preserve">④ Sotto. の保証</w:t>
+            </w:r>
+          </w:p>
+        </w:tc>
+        <w:tc>
+          <w:tcPr>
+            <w:tcW w:type="dxa" w:w="6900"/>
+            <w:tcBorders>
+              <w:top w:val="single" w:color="D8D2C6" w:sz="4"/>
+              <w:left w:val="single" w:color="D8D2C6" w:sz="4"/>
+              <w:bottom w:val="single" w:color="D8D2C6" w:sz="4"/>
+              <w:right w:val="single" w:color="D8D2C6" w:sz="4"/>
+            </w:tcBorders>
+            <w:tcMar>
+              <w:top w:type="dxa" w:w="90"/>
+              <w:left w:type="dxa" w:w="130"/>
+              <w:bottom w:type="dxa" w:w="90"/>
+              <w:right w:type="dxa" w:w="130"/>
+            </w:tcMar>
+          </w:tcPr>
+          <w:p>
+            <w:pPr>
+              <w:spacing w:after="0" w:before="0"/>
+            </w:pPr>
+            <w:r>
+              <w:rPr>
+                <w:rFonts w:ascii="Noto Serif JP" w:cs="Noto Serif JP" w:eastAsia="Noto Serif JP" w:hAnsi="Noto Serif JP"/>
+                <w:b w:val="false"/>
+                <w:bCs w:val="false"/>
+                <w:color w:val="1A1A1A"/>
+                <w:sz w:val="20"/>
+                <w:szCs w:val="20"/>
+              </w:rPr>
+              <w:t xml:space="preserve">Sotto. は店舗オーナーに対し「採用楽曲の利用範囲内でのクレームに一定範囲で対応する」と約束する（Premium 契約条項）。</w:t>
+            </w:r>
+          </w:p>
+        </w:tc>
+      </w:tr>
+      <w:tr>
+        <w:tc>
+          <w:tcPr>
+            <w:tcW w:type="dxa" w:w="2400"/>
+            <w:tcBorders>
+              <w:top w:val="single" w:color="D8D2C6" w:sz="4"/>
+              <w:left w:val="single" w:color="D8D2C6" w:sz="4"/>
+              <w:bottom w:val="single" w:color="D8D2C6" w:sz="4"/>
+              <w:right w:val="single" w:color="D8D2C6" w:sz="4"/>
+            </w:tcBorders>
+            <w:shd w:fill="F4F1EC" w:val="clear"/>
+            <w:tcMar>
+              <w:top w:type="dxa" w:w="90"/>
+              <w:left w:type="dxa" w:w="130"/>
+              <w:bottom w:type="dxa" w:w="90"/>
+              <w:right w:type="dxa" w:w="130"/>
+            </w:tcMar>
+          </w:tcPr>
+          <w:p>
+            <w:pPr>
+              <w:spacing w:after="0" w:before="0"/>
+            </w:pPr>
+            <w:r>
+              <w:rPr>
+                <w:rFonts w:ascii="Noto Serif JP" w:cs="Noto Serif JP" w:eastAsia="Noto Serif JP" w:hAnsi="Noto Serif JP"/>
+                <w:b/>
+                <w:bCs/>
+                <w:color w:val="1A1A1A"/>
+                <w:sz w:val="20"/>
+                <w:szCs w:val="20"/>
+              </w:rPr>
+              <w:t xml:space="preserve">⑤ DMCA / 削除フロー</w:t>
+            </w:r>
+          </w:p>
+        </w:tc>
+        <w:tc>
+          <w:tcPr>
+            <w:tcW w:type="dxa" w:w="6900"/>
+            <w:tcBorders>
+              <w:top w:val="single" w:color="D8D2C6" w:sz="4"/>
+              <w:left w:val="single" w:color="D8D2C6" w:sz="4"/>
+              <w:bottom w:val="single" w:color="D8D2C6" w:sz="4"/>
+              <w:right w:val="single" w:color="D8D2C6" w:sz="4"/>
+            </w:tcBorders>
+            <w:tcMar>
+              <w:top w:type="dxa" w:w="90"/>
+              <w:left w:type="dxa" w:w="130"/>
+              <w:bottom w:type="dxa" w:w="90"/>
+              <w:right w:type="dxa" w:w="130"/>
+            </w:tcMar>
+          </w:tcPr>
+          <w:p>
+            <w:pPr>
+              <w:spacing w:after="0" w:before="0"/>
+            </w:pPr>
+            <w:r>
+              <w:rPr>
+                <w:rFonts w:ascii="Noto Serif JP" w:cs="Noto Serif JP" w:eastAsia="Noto Serif JP" w:hAnsi="Noto Serif JP"/>
+                <w:b w:val="false"/>
+                <w:bCs w:val="false"/>
+                <w:color w:val="1A1A1A"/>
+                <w:sz w:val="20"/>
+                <w:szCs w:val="20"/>
+              </w:rPr>
+              <w:t xml:space="preserve">権利者から削除申請があった場合、24時間以内に当該楽曲を非公開化、投稿者に通知し、反論期間を設ける。</w:t>
+            </w:r>
+          </w:p>
+        </w:tc>
+      </w:tr>
+    </w:tbl>
+    <w:p>
+      <w:pPr>
+        <w:pStyle w:val="Heading2"/>
+        <w:spacing w:after="140" w:before="280"/>
+      </w:pPr>
+      <w:r>
+        <w:rPr>
+          <w:rFonts w:ascii="Noto Serif JP" w:cs="Noto Serif JP" w:eastAsia="Noto Serif JP" w:hAnsi="Noto Serif JP"/>
+          <w:b/>
+          <w:bCs/>
+          <w:color w:val="1A1A1A"/>
+          <w:sz w:val="26"/>
+          <w:szCs w:val="26"/>
+        </w:rPr>
+        <w:t xml:space="preserve">10.2 投稿フォームの保証チェック</w:t>
+      </w:r>
+    </w:p>
+    <w:p>
+      <w:pPr>
+        <w:spacing w:after="60" w:before="60"/>
+      </w:pPr>
+      <w:r>
+        <w:rPr>
+          <w:rFonts w:ascii="Noto Serif JP" w:cs="Noto Serif JP" w:eastAsia="Noto Serif JP" w:hAnsi="Noto Serif JP"/>
+          <w:b w:val="false"/>
+          <w:bCs w:val="false"/>
+          <w:i w:val="false"/>
+          <w:iCs w:val="false"/>
+          <w:color w:val="1A1A1A"/>
+          <w:sz w:val="22"/>
+          <w:szCs w:val="22"/>
+        </w:rPr>
+        <w:t xml:space="preserve">クリエイターが作品を投稿するとき、以下のチェックを必須とする：</w:t>
+      </w:r>
+    </w:p>
+    <w:p>
+      <w:pPr>
+        <w:spacing w:after="60" w:before="60"/>
+      </w:pPr>
+      <w:r>
+        <w:rPr>
+          <w:rFonts w:ascii="Noto Serif JP" w:cs="Noto Serif JP" w:eastAsia="Noto Serif JP" w:hAnsi="Noto Serif JP"/>
+          <w:b w:val="false"/>
+          <w:bCs w:val="false"/>
+          <w:i w:val="false"/>
+          <w:iCs w:val="false"/>
+          <w:color w:val="1A1A1A"/>
+          <w:sz w:val="22"/>
+          <w:szCs w:val="22"/>
+        </w:rPr>
+        <w:t xml:space="preserve"/>
+      </w:r>
+    </w:p>
+    <w:p>
+      <w:pPr>
+        <w:pStyle w:val="ListParagraph"/>
+        <w:numPr>
+          <w:ilvl w:val="0"/>
+          <w:numId w:val="2"/>
+        </w:numPr>
+        <w:spacing w:after="30" w:before="30"/>
+      </w:pPr>
+      <w:r>
+        <w:rPr>
+          <w:rFonts w:ascii="Noto Serif JP" w:cs="Noto Serif JP" w:eastAsia="Noto Serif JP" w:hAnsi="Noto Serif JP"/>
+          <w:color w:val="1A1A1A"/>
+          <w:sz w:val="22"/>
+          <w:szCs w:val="22"/>
+        </w:rPr>
+        <w:t xml:space="preserve">□ この楽曲は私が生成・制作したものであり、第三者の権利を侵害しないことを保証します</w:t>
+      </w:r>
+    </w:p>
+    <w:p>
+      <w:pPr>
+        <w:pStyle w:val="ListParagraph"/>
+        <w:numPr>
+          <w:ilvl w:val="0"/>
+          <w:numId w:val="2"/>
+        </w:numPr>
+        <w:spacing w:after="30" w:before="30"/>
+      </w:pPr>
+      <w:r>
+        <w:rPr>
+          <w:rFonts w:ascii="Noto Serif JP" w:cs="Noto Serif JP" w:eastAsia="Noto Serif JP" w:hAnsi="Noto Serif JP"/>
+          <w:color w:val="1A1A1A"/>
+          <w:sz w:val="22"/>
+          <w:szCs w:val="22"/>
+        </w:rPr>
+        <w:t xml:space="preserve">□ 使用した AI ツール（Suno / Udio 等）の商用利用ライセンスを保有しています</w:t>
+      </w:r>
+    </w:p>
+    <w:p>
+      <w:pPr>
+        <w:pStyle w:val="ListParagraph"/>
+        <w:numPr>
+          <w:ilvl w:val="0"/>
+          <w:numId w:val="2"/>
+        </w:numPr>
+        <w:spacing w:after="30" w:before="30"/>
+      </w:pPr>
+      <w:r>
+        <w:rPr>
+          <w:rFonts w:ascii="Noto Serif JP" w:cs="Noto Serif JP" w:eastAsia="Noto Serif JP" w:hAnsi="Noto Serif JP"/>
+          <w:color w:val="1A1A1A"/>
+          <w:sz w:val="22"/>
+          <w:szCs w:val="22"/>
+        </w:rPr>
+        <w:t xml:space="preserve">□ Sotto. への配信・表示・プロモーション利用を許諾します</w:t>
+      </w:r>
+    </w:p>
+    <w:p>
+      <w:pPr>
+        <w:pStyle w:val="ListParagraph"/>
+        <w:numPr>
+          <w:ilvl w:val="0"/>
+          <w:numId w:val="2"/>
+        </w:numPr>
+        <w:spacing w:after="30" w:before="30"/>
+      </w:pPr>
+      <w:r>
+        <w:rPr>
+          <w:rFonts w:ascii="Noto Serif JP" w:cs="Noto Serif JP" w:eastAsia="Noto Serif JP" w:hAnsi="Noto Serif JP"/>
+          <w:color w:val="1A1A1A"/>
+          <w:sz w:val="22"/>
+          <w:szCs w:val="22"/>
+        </w:rPr>
+        <w:t xml:space="preserve">□ Sotto Spaces 候補にする場合：店舗が商用利用することに同意します</w:t>
+      </w:r>
+    </w:p>
+    <w:p>
+      <w:pPr>
+        <w:spacing w:after="60" w:before="60"/>
+      </w:pPr>
+      <w:r>
+        <w:rPr>
+          <w:rFonts w:ascii="Noto Serif JP" w:cs="Noto Serif JP" w:eastAsia="Noto Serif JP" w:hAnsi="Noto Serif JP"/>
+          <w:b w:val="false"/>
+          <w:bCs w:val="false"/>
+          <w:i w:val="false"/>
+          <w:iCs w:val="false"/>
+          <w:color w:val="1A1A1A"/>
+          <w:sz w:val="22"/>
+          <w:szCs w:val="22"/>
+        </w:rPr>
+        <w:t xml:space="preserve"/>
+      </w:r>
+    </w:p>
+    <w:p>
+      <w:pPr>
+        <w:spacing w:after="60" w:before="60"/>
+      </w:pPr>
+      <w:r>
+        <w:rPr>
+          <w:rFonts w:ascii="Noto Serif JP" w:cs="Noto Serif JP" w:eastAsia="Noto Serif JP" w:hAnsi="Noto Serif JP"/>
+          <w:b w:val="false"/>
+          <w:bCs w:val="false"/>
+          <w:i/>
+          <w:iCs/>
+          <w:color w:val="6E6859"/>
+          <w:sz w:val="22"/>
+          <w:szCs w:val="22"/>
+        </w:rPr>
+        <w:t xml:space="preserve">各チェックは独立し、最後3つは任意（ただし Spaces 候補にするには3つ目以降のチェックが必要）。</w:t>
+      </w:r>
+    </w:p>
+    <w:p>
+      <w:pPr>
+        <w:pStyle w:val="Heading2"/>
+        <w:spacing w:after="140" w:before="280"/>
+      </w:pPr>
+      <w:r>
+        <w:rPr>
+          <w:rFonts w:ascii="Noto Serif JP" w:cs="Noto Serif JP" w:eastAsia="Noto Serif JP" w:hAnsi="Noto Serif JP"/>
+          <w:b/>
+          <w:bCs/>
+          <w:color w:val="1A1A1A"/>
+          <w:sz w:val="26"/>
+          <w:szCs w:val="26"/>
+        </w:rPr>
+        <w:t xml:space="preserve">10.3 投稿時に記録するメタデータ</w:t>
+      </w:r>
+    </w:p>
+    <w:p>
+      <w:pPr>
+        <w:spacing w:after="60" w:before="60"/>
+      </w:pPr>
+      <w:r>
+        <w:rPr>
+          <w:rFonts w:ascii="Noto Serif JP" w:cs="Noto Serif JP" w:eastAsia="Noto Serif JP" w:hAnsi="Noto Serif JP"/>
+          <w:b w:val="false"/>
+          <w:bCs w:val="false"/>
+          <w:i w:val="false"/>
+          <w:iCs w:val="false"/>
+          <w:color w:val="1A1A1A"/>
+          <w:sz w:val="22"/>
+          <w:szCs w:val="22"/>
+        </w:rPr>
+        <w:t xml:space="preserve">将来の紛争時のために、投稿時に以下を works テーブルに記録する：</w:t>
+      </w:r>
+    </w:p>
+    <w:p>
+      <w:pPr>
+        <w:spacing w:after="60" w:before="60"/>
+      </w:pPr>
+      <w:r>
+        <w:rPr>
+          <w:rFonts w:ascii="Noto Serif JP" w:cs="Noto Serif JP" w:eastAsia="Noto Serif JP" w:hAnsi="Noto Serif JP"/>
+          <w:b w:val="false"/>
+          <w:bCs w:val="false"/>
+          <w:i w:val="false"/>
+          <w:iCs w:val="false"/>
+          <w:color w:val="1A1A1A"/>
+          <w:sz w:val="22"/>
+          <w:szCs w:val="22"/>
+        </w:rPr>
+        <w:t xml:space="preserve"/>
+      </w:r>
+    </w:p>
+    <w:tbl>
+      <w:tblPr>
+        <w:tblW w:type="dxa" w:w="9300"/>
+        <w:tblBorders>
+          <w:top w:val="single" w:color="auto" w:sz="4"/>
+          <w:left w:val="single" w:color="auto" w:sz="4"/>
+          <w:bottom w:val="single" w:color="auto" w:sz="4"/>
+          <w:right w:val="single" w:color="auto" w:sz="4"/>
+          <w:insideH w:val="single" w:color="auto" w:sz="4"/>
+          <w:insideV w:val="single" w:color="auto" w:sz="4"/>
+        </w:tblBorders>
+      </w:tblPr>
+      <w:tblGrid>
+        <w:gridCol w:w="3000"/>
+        <w:gridCol w:w="6300"/>
+      </w:tblGrid>
+      <w:tr>
+        <w:tc>
+          <w:tcPr>
+            <w:tcW w:type="dxa" w:w="3000"/>
+            <w:tcBorders>
+              <w:top w:val="single" w:color="D8D2C6" w:sz="4"/>
+              <w:left w:val="single" w:color="D8D2C6" w:sz="4"/>
+              <w:bottom w:val="single" w:color="D8D2C6" w:sz="4"/>
+              <w:right w:val="single" w:color="D8D2C6" w:sz="4"/>
+            </w:tcBorders>
+            <w:shd w:fill="F4F1EC" w:val="clear"/>
+            <w:tcMar>
+              <w:top w:type="dxa" w:w="90"/>
+              <w:left w:type="dxa" w:w="130"/>
+              <w:bottom w:type="dxa" w:w="90"/>
+              <w:right w:type="dxa" w:w="130"/>
+            </w:tcMar>
+          </w:tcPr>
+          <w:p>
+            <w:pPr>
+              <w:spacing w:after="0" w:before="0"/>
+            </w:pPr>
+            <w:r>
+              <w:rPr>
+                <w:rFonts w:ascii="Noto Serif JP" w:cs="Noto Serif JP" w:eastAsia="Noto Serif JP" w:hAnsi="Noto Serif JP"/>
+                <w:b/>
+                <w:bCs/>
+                <w:color w:val="1A1A1A"/>
+                <w:sz w:val="20"/>
+                <w:szCs w:val="20"/>
+              </w:rPr>
+              <w:t xml:space="preserve">ai_tools</w:t>
+            </w:r>
+          </w:p>
+        </w:tc>
+        <w:tc>
+          <w:tcPr>
+            <w:tcW w:type="dxa" w:w="6300"/>
+            <w:tcBorders>
+              <w:top w:val="single" w:color="D8D2C6" w:sz="4"/>
+              <w:left w:val="single" w:color="D8D2C6" w:sz="4"/>
+              <w:bottom w:val="single" w:color="D8D2C6" w:sz="4"/>
+              <w:right w:val="single" w:color="D8D2C6" w:sz="4"/>
+            </w:tcBorders>
+            <w:tcMar>
+              <w:top w:type="dxa" w:w="90"/>
+              <w:left w:type="dxa" w:w="130"/>
+              <w:bottom w:type="dxa" w:w="90"/>
+              <w:right w:type="dxa" w:w="130"/>
+            </w:tcMar>
+          </w:tcPr>
+          <w:p>
+            <w:pPr>
+              <w:spacing w:after="0" w:before="0"/>
+            </w:pPr>
+            <w:r>
+              <w:rPr>
+                <w:rFonts w:ascii="Noto Serif JP" w:cs="Noto Serif JP" w:eastAsia="Noto Serif JP" w:hAnsi="Noto Serif JP"/>
+                <w:b w:val="false"/>
+                <w:bCs w:val="false"/>
+                <w:color w:val="1A1A1A"/>
+                <w:sz w:val="20"/>
+                <w:szCs w:val="20"/>
+              </w:rPr>
+              <w:t xml:space="preserve">使用したAIツール名（複数可）</w:t>
+            </w:r>
+          </w:p>
+        </w:tc>
+      </w:tr>
+      <w:tr>
+        <w:tc>
+          <w:tcPr>
+            <w:tcW w:type="dxa" w:w="3000"/>
+            <w:tcBorders>
+              <w:top w:val="single" w:color="D8D2C6" w:sz="4"/>
+              <w:left w:val="single" w:color="D8D2C6" w:sz="4"/>
+              <w:bottom w:val="single" w:color="D8D2C6" w:sz="4"/>
+              <w:right w:val="single" w:color="D8D2C6" w:sz="4"/>
+            </w:tcBorders>
+            <w:shd w:fill="F4F1EC" w:val="clear"/>
+            <w:tcMar>
+              <w:top w:type="dxa" w:w="90"/>
+              <w:left w:type="dxa" w:w="130"/>
+              <w:bottom w:type="dxa" w:w="90"/>
+              <w:right w:type="dxa" w:w="130"/>
+            </w:tcMar>
+          </w:tcPr>
+          <w:p>
+            <w:pPr>
+              <w:spacing w:after="0" w:before="0"/>
+            </w:pPr>
+            <w:r>
+              <w:rPr>
+                <w:rFonts w:ascii="Noto Serif JP" w:cs="Noto Serif JP" w:eastAsia="Noto Serif JP" w:hAnsi="Noto Serif JP"/>
+                <w:b/>
+                <w:bCs/>
+                <w:color w:val="1A1A1A"/>
+                <w:sz w:val="20"/>
+                <w:szCs w:val="20"/>
+              </w:rPr>
+              <w:t xml:space="preserve">prompt</w:t>
+            </w:r>
+          </w:p>
+        </w:tc>
+        <w:tc>
+          <w:tcPr>
+            <w:tcW w:type="dxa" w:w="6300"/>
+            <w:tcBorders>
+              <w:top w:val="single" w:color="D8D2C6" w:sz="4"/>
+              <w:left w:val="single" w:color="D8D2C6" w:sz="4"/>
+              <w:bottom w:val="single" w:color="D8D2C6" w:sz="4"/>
+              <w:right w:val="single" w:color="D8D2C6" w:sz="4"/>
+            </w:tcBorders>
+            <w:tcMar>
+              <w:top w:type="dxa" w:w="90"/>
+              <w:left w:type="dxa" w:w="130"/>
+              <w:bottom w:type="dxa" w:w="90"/>
+              <w:right w:type="dxa" w:w="130"/>
+            </w:tcMar>
+          </w:tcPr>
+          <w:p>
+            <w:pPr>
+              <w:spacing w:after="0" w:before="0"/>
+            </w:pPr>
+            <w:r>
+              <w:rPr>
+                <w:rFonts w:ascii="Noto Serif JP" w:cs="Noto Serif JP" w:eastAsia="Noto Serif JP" w:hAnsi="Noto Serif JP"/>
+                <w:b w:val="false"/>
+                <w:bCs w:val="false"/>
+                <w:color w:val="1A1A1A"/>
+                <w:sz w:val="20"/>
+                <w:szCs w:val="20"/>
+              </w:rPr>
+              <w:t xml:space="preserve">生成プロンプト（保証の根拠 / 監査用）</w:t>
+            </w:r>
+          </w:p>
+        </w:tc>
+      </w:tr>
+      <w:tr>
+        <w:tc>
+          <w:tcPr>
+            <w:tcW w:type="dxa" w:w="3000"/>
+            <w:tcBorders>
+              <w:top w:val="single" w:color="D8D2C6" w:sz="4"/>
+              <w:left w:val="single" w:color="D8D2C6" w:sz="4"/>
+              <w:bottom w:val="single" w:color="D8D2C6" w:sz="4"/>
+              <w:right w:val="single" w:color="D8D2C6" w:sz="4"/>
+            </w:tcBorders>
+            <w:shd w:fill="F4F1EC" w:val="clear"/>
+            <w:tcMar>
+              <w:top w:type="dxa" w:w="90"/>
+              <w:left w:type="dxa" w:w="130"/>
+              <w:bottom w:type="dxa" w:w="90"/>
+              <w:right w:type="dxa" w:w="130"/>
+            </w:tcMar>
+          </w:tcPr>
+          <w:p>
+            <w:pPr>
+              <w:spacing w:after="0" w:before="0"/>
+            </w:pPr>
+            <w:r>
+              <w:rPr>
+                <w:rFonts w:ascii="Noto Serif JP" w:cs="Noto Serif JP" w:eastAsia="Noto Serif JP" w:hAnsi="Noto Serif JP"/>
+                <w:b/>
+                <w:bCs/>
+                <w:color w:val="1A1A1A"/>
+                <w:sz w:val="20"/>
+                <w:szCs w:val="20"/>
+              </w:rPr>
+              <w:t xml:space="preserve">license_confirmed_at</w:t>
+            </w:r>
+          </w:p>
+        </w:tc>
+        <w:tc>
+          <w:tcPr>
+            <w:tcW w:type="dxa" w:w="6300"/>
+            <w:tcBorders>
+              <w:top w:val="single" w:color="D8D2C6" w:sz="4"/>
+              <w:left w:val="single" w:color="D8D2C6" w:sz="4"/>
+              <w:bottom w:val="single" w:color="D8D2C6" w:sz="4"/>
+              <w:right w:val="single" w:color="D8D2C6" w:sz="4"/>
+            </w:tcBorders>
+            <w:tcMar>
+              <w:top w:type="dxa" w:w="90"/>
+              <w:left w:type="dxa" w:w="130"/>
+              <w:bottom w:type="dxa" w:w="90"/>
+              <w:right w:type="dxa" w:w="130"/>
+            </w:tcMar>
+          </w:tcPr>
+          <w:p>
+            <w:pPr>
+              <w:spacing w:after="0" w:before="0"/>
+            </w:pPr>
+            <w:r>
+              <w:rPr>
+                <w:rFonts w:ascii="Noto Serif JP" w:cs="Noto Serif JP" w:eastAsia="Noto Serif JP" w:hAnsi="Noto Serif JP"/>
+                <w:b w:val="false"/>
+                <w:bCs w:val="false"/>
+                <w:color w:val="1A1A1A"/>
+                <w:sz w:val="20"/>
+                <w:szCs w:val="20"/>
+              </w:rPr>
+              <w:t xml:space="preserve">商用ライセンス保証チェックを行った日時</w:t>
+            </w:r>
+          </w:p>
+        </w:tc>
+      </w:tr>
+      <w:tr>
+        <w:tc>
+          <w:tcPr>
+            <w:tcW w:type="dxa" w:w="3000"/>
+            <w:tcBorders>
+              <w:top w:val="single" w:color="D8D2C6" w:sz="4"/>
+              <w:left w:val="single" w:color="D8D2C6" w:sz="4"/>
+              <w:bottom w:val="single" w:color="D8D2C6" w:sz="4"/>
+              <w:right w:val="single" w:color="D8D2C6" w:sz="4"/>
+            </w:tcBorders>
+            <w:shd w:fill="F4F1EC" w:val="clear"/>
+            <w:tcMar>
+              <w:top w:type="dxa" w:w="90"/>
+              <w:left w:type="dxa" w:w="130"/>
+              <w:bottom w:type="dxa" w:w="90"/>
+              <w:right w:type="dxa" w:w="130"/>
+            </w:tcMar>
+          </w:tcPr>
+          <w:p>
+            <w:pPr>
+              <w:spacing w:after="0" w:before="0"/>
+            </w:pPr>
+            <w:r>
+              <w:rPr>
+                <w:rFonts w:ascii="Noto Serif JP" w:cs="Noto Serif JP" w:eastAsia="Noto Serif JP" w:hAnsi="Noto Serif JP"/>
+                <w:b/>
+                <w:bCs/>
+                <w:color w:val="1A1A1A"/>
+                <w:sz w:val="20"/>
+                <w:szCs w:val="20"/>
+              </w:rPr>
+              <w:t xml:space="preserve">license_confirmed_ip</w:t>
+            </w:r>
+          </w:p>
+        </w:tc>
+        <w:tc>
+          <w:tcPr>
+            <w:tcW w:type="dxa" w:w="6300"/>
+            <w:tcBorders>
+              <w:top w:val="single" w:color="D8D2C6" w:sz="4"/>
+              <w:left w:val="single" w:color="D8D2C6" w:sz="4"/>
+              <w:bottom w:val="single" w:color="D8D2C6" w:sz="4"/>
+              <w:right w:val="single" w:color="D8D2C6" w:sz="4"/>
+            </w:tcBorders>
+            <w:tcMar>
+              <w:top w:type="dxa" w:w="90"/>
+              <w:left w:type="dxa" w:w="130"/>
+              <w:bottom w:type="dxa" w:w="90"/>
+              <w:right w:type="dxa" w:w="130"/>
+            </w:tcMar>
+          </w:tcPr>
+          <w:p>
+            <w:pPr>
+              <w:spacing w:after="0" w:before="0"/>
+            </w:pPr>
+            <w:r>
+              <w:rPr>
+                <w:rFonts w:ascii="Noto Serif JP" w:cs="Noto Serif JP" w:eastAsia="Noto Serif JP" w:hAnsi="Noto Serif JP"/>
+                <w:b w:val="false"/>
+                <w:bCs w:val="false"/>
+                <w:color w:val="1A1A1A"/>
+                <w:sz w:val="20"/>
+                <w:szCs w:val="20"/>
+              </w:rPr>
+              <w:t xml:space="preserve">チェック時の IP アドレス（証拠保全）</w:t>
+            </w:r>
+          </w:p>
+        </w:tc>
+      </w:tr>
+      <w:tr>
+        <w:tc>
+          <w:tcPr>
+            <w:tcW w:type="dxa" w:w="3000"/>
+            <w:tcBorders>
+              <w:top w:val="single" w:color="D8D2C6" w:sz="4"/>
+              <w:left w:val="single" w:color="D8D2C6" w:sz="4"/>
+              <w:bottom w:val="single" w:color="D8D2C6" w:sz="4"/>
+              <w:right w:val="single" w:color="D8D2C6" w:sz="4"/>
+            </w:tcBorders>
+            <w:shd w:fill="F4F1EC" w:val="clear"/>
+            <w:tcMar>
+              <w:top w:type="dxa" w:w="90"/>
+              <w:left w:type="dxa" w:w="130"/>
+              <w:bottom w:type="dxa" w:w="90"/>
+              <w:right w:type="dxa" w:w="130"/>
+            </w:tcMar>
+          </w:tcPr>
+          <w:p>
+            <w:pPr>
+              <w:spacing w:after="0" w:before="0"/>
+            </w:pPr>
+            <w:r>
+              <w:rPr>
+                <w:rFonts w:ascii="Noto Serif JP" w:cs="Noto Serif JP" w:eastAsia="Noto Serif JP" w:hAnsi="Noto Serif JP"/>
+                <w:b/>
+                <w:bCs/>
+                <w:color w:val="1A1A1A"/>
+                <w:sz w:val="20"/>
+                <w:szCs w:val="20"/>
+              </w:rPr>
+              <w:t xml:space="preserve">tos_version</w:t>
+            </w:r>
+          </w:p>
+        </w:tc>
+        <w:tc>
+          <w:tcPr>
+            <w:tcW w:type="dxa" w:w="6300"/>
+            <w:tcBorders>
+              <w:top w:val="single" w:color="D8D2C6" w:sz="4"/>
+              <w:left w:val="single" w:color="D8D2C6" w:sz="4"/>
+              <w:bottom w:val="single" w:color="D8D2C6" w:sz="4"/>
+              <w:right w:val="single" w:color="D8D2C6" w:sz="4"/>
+            </w:tcBorders>
+            <w:tcMar>
+              <w:top w:type="dxa" w:w="90"/>
+              <w:left w:type="dxa" w:w="130"/>
+              <w:bottom w:type="dxa" w:w="90"/>
+              <w:right w:type="dxa" w:w="130"/>
+            </w:tcMar>
+          </w:tcPr>
+          <w:p>
+            <w:pPr>
+              <w:spacing w:after="0" w:before="0"/>
+            </w:pPr>
+            <w:r>
+              <w:rPr>
+                <w:rFonts w:ascii="Noto Serif JP" w:cs="Noto Serif JP" w:eastAsia="Noto Serif JP" w:hAnsi="Noto Serif JP"/>
+                <w:b w:val="false"/>
+                <w:bCs w:val="false"/>
+                <w:color w:val="1A1A1A"/>
+                <w:sz w:val="20"/>
+                <w:szCs w:val="20"/>
+              </w:rPr>
+              <w:t xml:space="preserve">同意した利用規約のバージョン番号</w:t>
+            </w:r>
+          </w:p>
+        </w:tc>
+      </w:tr>
+    </w:tbl>
+    <w:p>
+      <w:pPr>
+        <w:pStyle w:val="Heading2"/>
+        <w:spacing w:after="140" w:before="280"/>
+      </w:pPr>
+      <w:r>
+        <w:rPr>
+          <w:rFonts w:ascii="Noto Serif JP" w:cs="Noto Serif JP" w:eastAsia="Noto Serif JP" w:hAnsi="Noto Serif JP"/>
+          <w:b/>
+          <w:bCs/>
+          <w:color w:val="1A1A1A"/>
+          <w:sz w:val="26"/>
+          <w:szCs w:val="26"/>
+        </w:rPr>
+        <w:t xml:space="preserve">10.4 店舗側（Sotto Spaces）への保証構造</w:t>
+      </w:r>
+    </w:p>
+    <w:p>
+      <w:pPr>
+        <w:spacing w:after="60" w:before="60"/>
+      </w:pPr>
+      <w:r>
+        <w:rPr>
+          <w:rFonts w:ascii="Noto Serif JP" w:cs="Noto Serif JP" w:eastAsia="Noto Serif JP" w:hAnsi="Noto Serif JP"/>
+          <w:b w:val="false"/>
+          <w:bCs w:val="false"/>
+          <w:i w:val="false"/>
+          <w:iCs w:val="false"/>
+          <w:color w:val="1A1A1A"/>
+          <w:sz w:val="22"/>
+          <w:szCs w:val="22"/>
+        </w:rPr>
+        <w:t xml:space="preserve">店舗オーナーが「これ商用利用しても大丈夫？」と聞かれた時、Sotto. が答えられる構造を作る：</w:t>
+      </w:r>
+    </w:p>
+    <w:p>
+      <w:pPr>
+        <w:spacing w:after="60" w:before="60"/>
+      </w:pPr>
+      <w:r>
+        <w:rPr>
+          <w:rFonts w:ascii="Noto Serif JP" w:cs="Noto Serif JP" w:eastAsia="Noto Serif JP" w:hAnsi="Noto Serif JP"/>
+          <w:b w:val="false"/>
+          <w:bCs w:val="false"/>
+          <w:i w:val="false"/>
+          <w:iCs w:val="false"/>
+          <w:color w:val="1A1A1A"/>
+          <w:sz w:val="22"/>
+          <w:szCs w:val="22"/>
+        </w:rPr>
+        <w:t xml:space="preserve"/>
+      </w:r>
+    </w:p>
+    <w:p>
+      <w:pPr>
+        <w:pBdr>
+          <w:left w:val="single" w:color="B8945C" w:sz="12" w:space="12"/>
+        </w:pBdr>
+        <w:spacing w:after="120" w:before="120"/>
+        <w:ind w:left="480" w:right="480"/>
+      </w:pPr>
+      <w:r>
+        <w:rPr>
+          <w:rFonts w:ascii="Noto Serif JP" w:cs="Noto Serif JP" w:eastAsia="Noto Serif JP" w:hAnsi="Noto Serif JP"/>
+          <w:i/>
+          <w:iCs/>
+          <w:color w:val="6E6859"/>
+          <w:sz w:val="22"/>
+          <w:szCs w:val="22"/>
+        </w:rPr>
+        <w:t xml:space="preserve">Sotto. Premium 契約中の店舗様は、Sotto Spaces 経由で再生される楽曲について、契約期間中の商用利用を許諾されています。万一第三者から権利クレームがあった場合、Sotto. が一次対応窓口となり、楽曲の即時差替え＋月額返金で対応します。</w:t>
+      </w:r>
+    </w:p>
+    <w:p>
+      <w:pPr>
+        <w:spacing w:after="60" w:before="60"/>
+      </w:pPr>
+      <w:r>
+        <w:rPr>
+          <w:rFonts w:ascii="Noto Serif JP" w:cs="Noto Serif JP" w:eastAsia="Noto Serif JP" w:hAnsi="Noto Serif JP"/>
+          <w:b w:val="false"/>
+          <w:bCs w:val="false"/>
+          <w:i w:val="false"/>
+          <w:iCs w:val="false"/>
+          <w:color w:val="1A1A1A"/>
+          <w:sz w:val="22"/>
+          <w:szCs w:val="22"/>
+        </w:rPr>
+        <w:t xml:space="preserve"/>
+      </w:r>
+    </w:p>
+    <w:p>
+      <w:pPr>
+        <w:spacing w:after="60" w:before="60"/>
+      </w:pPr>
+      <w:r>
+        <w:rPr>
+          <w:rFonts w:ascii="Noto Serif JP" w:cs="Noto Serif JP" w:eastAsia="Noto Serif JP" w:hAnsi="Noto Serif JP"/>
+          <w:b w:val="false"/>
+          <w:bCs w:val="false"/>
+          <w:i/>
+          <w:iCs/>
+          <w:color w:val="6E6859"/>
+          <w:sz w:val="22"/>
+          <w:szCs w:val="22"/>
+        </w:rPr>
+        <w:t xml:space="preserve">この一文があるだけで、店舗オーナーの不安が解消され、Sotto. の差別化が確立する。</w:t>
+      </w:r>
+    </w:p>
+    <w:p>
+      <w:pPr>
+        <w:pStyle w:val="Heading2"/>
+        <w:spacing w:after="140" w:before="280"/>
+      </w:pPr>
+      <w:r>
+        <w:rPr>
+          <w:rFonts w:ascii="Noto Serif JP" w:cs="Noto Serif JP" w:eastAsia="Noto Serif JP" w:hAnsi="Noto Serif JP"/>
+          <w:b/>
+          <w:bCs/>
+          <w:color w:val="1A1A1A"/>
+          <w:sz w:val="26"/>
+          <w:szCs w:val="26"/>
+        </w:rPr>
+        <w:t xml:space="preserve">10.5 JASRAC / NexTone との関係</w:t>
+      </w:r>
+    </w:p>
+    <w:p>
+      <w:pPr>
+        <w:spacing w:after="60" w:before="60"/>
+      </w:pPr>
+      <w:r>
+        <w:rPr>
+          <w:rFonts w:ascii="Noto Serif JP" w:cs="Noto Serif JP" w:eastAsia="Noto Serif JP" w:hAnsi="Noto Serif JP"/>
+          <w:b w:val="false"/>
+          <w:bCs w:val="false"/>
+          <w:i w:val="false"/>
+          <w:iCs w:val="false"/>
+          <w:color w:val="1A1A1A"/>
+          <w:sz w:val="22"/>
+          <w:szCs w:val="22"/>
+        </w:rPr>
+        <w:t xml:space="preserve">日本の店舗BGM利用は、原則として JASRAC / NexTone への支払い義務がある（管理楽曲を流す場合）。Sotto. の楽曲は基本的に AI 生成物で個人クリエイターが投稿したものなので、現時点では JASRAC 等の管理外。</w:t>
+      </w:r>
+    </w:p>
+    <w:p>
+      <w:pPr>
+        <w:spacing w:after="60" w:before="60"/>
+      </w:pPr>
+      <w:r>
+        <w:rPr>
+          <w:rFonts w:ascii="Noto Serif JP" w:cs="Noto Serif JP" w:eastAsia="Noto Serif JP" w:hAnsi="Noto Serif JP"/>
+          <w:b w:val="false"/>
+          <w:bCs w:val="false"/>
+          <w:i w:val="false"/>
+          <w:iCs w:val="false"/>
+          <w:color w:val="1A1A1A"/>
+          <w:sz w:val="22"/>
+          <w:szCs w:val="22"/>
+        </w:rPr>
+        <w:t xml:space="preserve"/>
+      </w:r>
+    </w:p>
+    <w:tbl>
+      <w:tblPr>
+        <w:tblW w:type="dxa" w:w="9300"/>
+        <w:tblBorders>
+          <w:top w:val="single" w:color="auto" w:sz="4"/>
+          <w:left w:val="single" w:color="auto" w:sz="4"/>
+          <w:bottom w:val="single" w:color="auto" w:sz="4"/>
+          <w:right w:val="single" w:color="auto" w:sz="4"/>
+          <w:insideH w:val="single" w:color="auto" w:sz="4"/>
+          <w:insideV w:val="single" w:color="auto" w:sz="4"/>
+        </w:tblBorders>
+      </w:tblPr>
+      <w:tblGrid>
+        <w:gridCol w:w="3000"/>
+        <w:gridCol w:w="6300"/>
+      </w:tblGrid>
+      <w:tr>
+        <w:tc>
+          <w:tcPr>
+            <w:tcW w:type="dxa" w:w="3000"/>
+            <w:tcBorders>
+              <w:top w:val="single" w:color="D8D2C6" w:sz="4"/>
+              <w:left w:val="single" w:color="D8D2C6" w:sz="4"/>
+              <w:bottom w:val="single" w:color="D8D2C6" w:sz="4"/>
+              <w:right w:val="single" w:color="D8D2C6" w:sz="4"/>
+            </w:tcBorders>
+            <w:shd w:fill="F4F1EC" w:val="clear"/>
+            <w:tcMar>
+              <w:top w:type="dxa" w:w="90"/>
+              <w:left w:type="dxa" w:w="130"/>
+              <w:bottom w:type="dxa" w:w="90"/>
+              <w:right w:type="dxa" w:w="130"/>
+            </w:tcMar>
+          </w:tcPr>
+          <w:p>
+            <w:pPr>
+              <w:spacing w:after="0" w:before="0"/>
+            </w:pPr>
+            <w:r>
+              <w:rPr>
+                <w:rFonts w:ascii="Noto Serif JP" w:cs="Noto Serif JP" w:eastAsia="Noto Serif JP" w:hAnsi="Noto Serif JP"/>
+                <w:b/>
+                <w:bCs/>
+                <w:color w:val="1A1A1A"/>
+                <w:sz w:val="20"/>
+                <w:szCs w:val="20"/>
+              </w:rPr>
+              <w:t xml:space="preserve">現状（2026年時点）</w:t>
+            </w:r>
+          </w:p>
+        </w:tc>
+        <w:tc>
+          <w:tcPr>
+            <w:tcW w:type="dxa" w:w="6300"/>
+            <w:tcBorders>
+              <w:top w:val="single" w:color="D8D2C6" w:sz="4"/>
+              <w:left w:val="single" w:color="D8D2C6" w:sz="4"/>
+              <w:bottom w:val="single" w:color="D8D2C6" w:sz="4"/>
+              <w:right w:val="single" w:color="D8D2C6" w:sz="4"/>
+            </w:tcBorders>
+            <w:tcMar>
+              <w:top w:type="dxa" w:w="90"/>
+              <w:left w:type="dxa" w:w="130"/>
+              <w:bottom w:type="dxa" w:w="90"/>
+              <w:right w:type="dxa" w:w="130"/>
+            </w:tcMar>
+          </w:tcPr>
+          <w:p>
+            <w:pPr>
+              <w:spacing w:after="0" w:before="0"/>
+            </w:pPr>
+            <w:r>
+              <w:rPr>
+                <w:rFonts w:ascii="Noto Serif JP" w:cs="Noto Serif JP" w:eastAsia="Noto Serif JP" w:hAnsi="Noto Serif JP"/>
+                <w:b w:val="false"/>
+                <w:bCs w:val="false"/>
+                <w:color w:val="1A1A1A"/>
+                <w:sz w:val="20"/>
+                <w:szCs w:val="20"/>
+              </w:rPr>
+              <w:t xml:space="preserve">AI 生成楽曲は管理楽曲リストに含まれず、店舗側の追加負担なし</w:t>
+            </w:r>
+          </w:p>
+        </w:tc>
+      </w:tr>
+      <w:tr>
+        <w:tc>
+          <w:tcPr>
+            <w:tcW w:type="dxa" w:w="3000"/>
+            <w:tcBorders>
+              <w:top w:val="single" w:color="D8D2C6" w:sz="4"/>
+              <w:left w:val="single" w:color="D8D2C6" w:sz="4"/>
+              <w:bottom w:val="single" w:color="D8D2C6" w:sz="4"/>
+              <w:right w:val="single" w:color="D8D2C6" w:sz="4"/>
+            </w:tcBorders>
+            <w:shd w:fill="F4F1EC" w:val="clear"/>
+            <w:tcMar>
+              <w:top w:type="dxa" w:w="90"/>
+              <w:left w:type="dxa" w:w="130"/>
+              <w:bottom w:type="dxa" w:w="90"/>
+              <w:right w:type="dxa" w:w="130"/>
+            </w:tcMar>
+          </w:tcPr>
+          <w:p>
+            <w:pPr>
+              <w:spacing w:after="0" w:before="0"/>
+            </w:pPr>
+            <w:r>
+              <w:rPr>
+                <w:rFonts w:ascii="Noto Serif JP" w:cs="Noto Serif JP" w:eastAsia="Noto Serif JP" w:hAnsi="Noto Serif JP"/>
+                <w:b/>
+                <w:bCs/>
+                <w:color w:val="1A1A1A"/>
+                <w:sz w:val="20"/>
+                <w:szCs w:val="20"/>
+              </w:rPr>
+              <w:t xml:space="preserve">将来リスク</w:t>
+            </w:r>
+          </w:p>
+        </w:tc>
+        <w:tc>
+          <w:tcPr>
+            <w:tcW w:type="dxa" w:w="6300"/>
+            <w:tcBorders>
+              <w:top w:val="single" w:color="D8D2C6" w:sz="4"/>
+              <w:left w:val="single" w:color="D8D2C6" w:sz="4"/>
+              <w:bottom w:val="single" w:color="D8D2C6" w:sz="4"/>
+              <w:right w:val="single" w:color="D8D2C6" w:sz="4"/>
+            </w:tcBorders>
+            <w:tcMar>
+              <w:top w:type="dxa" w:w="90"/>
+              <w:left w:type="dxa" w:w="130"/>
+              <w:bottom w:type="dxa" w:w="90"/>
+              <w:right w:type="dxa" w:w="130"/>
+            </w:tcMar>
+          </w:tcPr>
+          <w:p>
+            <w:pPr>
+              <w:spacing w:after="0" w:before="0"/>
+            </w:pPr>
+            <w:r>
+              <w:rPr>
+                <w:rFonts w:ascii="Noto Serif JP" w:cs="Noto Serif JP" w:eastAsia="Noto Serif JP" w:hAnsi="Noto Serif JP"/>
+                <w:b w:val="false"/>
+                <w:bCs w:val="false"/>
+                <w:color w:val="1A1A1A"/>
+                <w:sz w:val="20"/>
+                <w:szCs w:val="20"/>
+              </w:rPr>
+              <w:t xml:space="preserve">JASRAC が AI 生成物を管理対象に含める可能性。継続ウォッチ必要</w:t>
+            </w:r>
+          </w:p>
+        </w:tc>
+      </w:tr>
+      <w:tr>
+        <w:tc>
+          <w:tcPr>
+            <w:tcW w:type="dxa" w:w="3000"/>
+            <w:tcBorders>
+              <w:top w:val="single" w:color="D8D2C6" w:sz="4"/>
+              <w:left w:val="single" w:color="D8D2C6" w:sz="4"/>
+              <w:bottom w:val="single" w:color="D8D2C6" w:sz="4"/>
+              <w:right w:val="single" w:color="D8D2C6" w:sz="4"/>
+            </w:tcBorders>
+            <w:shd w:fill="F4F1EC" w:val="clear"/>
+            <w:tcMar>
+              <w:top w:type="dxa" w:w="90"/>
+              <w:left w:type="dxa" w:w="130"/>
+              <w:bottom w:type="dxa" w:w="90"/>
+              <w:right w:type="dxa" w:w="130"/>
+            </w:tcMar>
+          </w:tcPr>
+          <w:p>
+            <w:pPr>
+              <w:spacing w:after="0" w:before="0"/>
+            </w:pPr>
+            <w:r>
+              <w:rPr>
+                <w:rFonts w:ascii="Noto Serif JP" w:cs="Noto Serif JP" w:eastAsia="Noto Serif JP" w:hAnsi="Noto Serif JP"/>
+                <w:b/>
+                <w:bCs/>
+                <w:color w:val="1A1A1A"/>
+                <w:sz w:val="20"/>
+                <w:szCs w:val="20"/>
+              </w:rPr>
+              <w:t xml:space="preserve">対策</w:t>
+            </w:r>
+          </w:p>
+        </w:tc>
+        <w:tc>
+          <w:tcPr>
+            <w:tcW w:type="dxa" w:w="6300"/>
+            <w:tcBorders>
+              <w:top w:val="single" w:color="D8D2C6" w:sz="4"/>
+              <w:left w:val="single" w:color="D8D2C6" w:sz="4"/>
+              <w:bottom w:val="single" w:color="D8D2C6" w:sz="4"/>
+              <w:right w:val="single" w:color="D8D2C6" w:sz="4"/>
+            </w:tcBorders>
+            <w:tcMar>
+              <w:top w:type="dxa" w:w="90"/>
+              <w:left w:type="dxa" w:w="130"/>
+              <w:bottom w:type="dxa" w:w="90"/>
+              <w:right w:type="dxa" w:w="130"/>
+            </w:tcMar>
+          </w:tcPr>
+          <w:p>
+            <w:pPr>
+              <w:spacing w:after="0" w:before="0"/>
+            </w:pPr>
+            <w:r>
+              <w:rPr>
+                <w:rFonts w:ascii="Noto Serif JP" w:cs="Noto Serif JP" w:eastAsia="Noto Serif JP" w:hAnsi="Noto Serif JP"/>
+                <w:b w:val="false"/>
+                <w:bCs w:val="false"/>
+                <w:color w:val="1A1A1A"/>
+                <w:sz w:val="20"/>
+                <w:szCs w:val="20"/>
+              </w:rPr>
+              <w:t xml:space="preserve">Sotto. として JASRAC / NexTone と早期に対話を始める。「AI 生成物の包括処理スキーム」を提案する</w:t>
+            </w:r>
+          </w:p>
+        </w:tc>
+      </w:tr>
+    </w:tbl>
+    <w:p>
+      <w:pPr>
+        <w:pStyle w:val="Heading2"/>
+        <w:spacing w:after="140" w:before="280"/>
+      </w:pPr>
+      <w:r>
+        <w:rPr>
+          <w:rFonts w:ascii="Noto Serif JP" w:cs="Noto Serif JP" w:eastAsia="Noto Serif JP" w:hAnsi="Noto Serif JP"/>
+          <w:b/>
+          <w:bCs/>
+          <w:color w:val="1A1A1A"/>
+          <w:sz w:val="26"/>
+          <w:szCs w:val="26"/>
+        </w:rPr>
+        <w:t xml:space="preserve">10.6 AI 学習データ訴訟への対応</w:t>
+      </w:r>
+    </w:p>
+    <w:p>
+      <w:pPr>
+        <w:spacing w:after="60" w:before="60"/>
+      </w:pPr>
+      <w:r>
+        <w:rPr>
+          <w:rFonts w:ascii="Noto Serif JP" w:cs="Noto Serif JP" w:eastAsia="Noto Serif JP" w:hAnsi="Noto Serif JP"/>
+          <w:b w:val="false"/>
+          <w:bCs w:val="false"/>
+          <w:i w:val="false"/>
+          <w:iCs w:val="false"/>
+          <w:color w:val="1A1A1A"/>
+          <w:sz w:val="22"/>
+          <w:szCs w:val="22"/>
+        </w:rPr>
+        <w:t xml:space="preserve">2024年6月、米国 RIAA が Suno / Udio を著作権侵害で提訴。判決次第で AI 音楽の合法性が大きく変わる可能性がある。</w:t>
+      </w:r>
+    </w:p>
+    <w:p>
+      <w:pPr>
+        <w:spacing w:after="60" w:before="60"/>
+      </w:pPr>
+      <w:r>
+        <w:rPr>
+          <w:rFonts w:ascii="Noto Serif JP" w:cs="Noto Serif JP" w:eastAsia="Noto Serif JP" w:hAnsi="Noto Serif JP"/>
+          <w:b w:val="false"/>
+          <w:bCs w:val="false"/>
+          <w:i w:val="false"/>
+          <w:iCs w:val="false"/>
+          <w:color w:val="1A1A1A"/>
+          <w:sz w:val="22"/>
+          <w:szCs w:val="22"/>
+        </w:rPr>
+        <w:t xml:space="preserve"/>
+      </w:r>
+    </w:p>
+    <w:p>
+      <w:pPr>
+        <w:pStyle w:val="Heading3"/>
+        <w:spacing w:after="100" w:before="200"/>
+      </w:pPr>
+      <w:r>
+        <w:rPr>
+          <w:rFonts w:ascii="Noto Serif JP" w:cs="Noto Serif JP" w:eastAsia="Noto Serif JP" w:hAnsi="Noto Serif JP"/>
+          <w:b/>
+          <w:bCs/>
+          <w:color w:val="B8945C"/>
+          <w:sz w:val="22"/>
+          <w:szCs w:val="22"/>
+        </w:rPr>
+        <w:t xml:space="preserve">Sotto. の立場</w:t>
+      </w:r>
+    </w:p>
+    <w:p>
+      <w:pPr>
+        <w:pStyle w:val="ListParagraph"/>
+        <w:numPr>
+          <w:ilvl w:val="0"/>
+          <w:numId w:val="2"/>
+        </w:numPr>
+        <w:spacing w:after="30" w:before="30"/>
+      </w:pPr>
+      <w:r>
+        <w:rPr>
+          <w:rFonts w:ascii="Noto Serif JP" w:cs="Noto Serif JP" w:eastAsia="Noto Serif JP" w:hAnsi="Noto Serif JP"/>
+          <w:color w:val="1A1A1A"/>
+          <w:sz w:val="22"/>
+          <w:szCs w:val="22"/>
+        </w:rPr>
+        <w:t xml:space="preserve">法務リスクを否定せず、開示する</w:t>
+      </w:r>
+    </w:p>
+    <w:p>
+      <w:pPr>
+        <w:pStyle w:val="ListParagraph"/>
+        <w:numPr>
+          <w:ilvl w:val="0"/>
+          <w:numId w:val="2"/>
+        </w:numPr>
+        <w:spacing w:after="30" w:before="30"/>
+      </w:pPr>
+      <w:r>
+        <w:rPr>
+          <w:rFonts w:ascii="Noto Serif JP" w:cs="Noto Serif JP" w:eastAsia="Noto Serif JP" w:hAnsi="Noto Serif JP"/>
+          <w:color w:val="1A1A1A"/>
+          <w:sz w:val="22"/>
+          <w:szCs w:val="22"/>
+        </w:rPr>
+        <w:t xml:space="preserve">利用規約に「AI ツール側の規約変更や法的判断によりサービス内容が変わる可能性」を明記</w:t>
+      </w:r>
+    </w:p>
+    <w:p>
+      <w:pPr>
+        <w:pStyle w:val="ListParagraph"/>
+        <w:numPr>
+          <w:ilvl w:val="0"/>
+          <w:numId w:val="2"/>
+        </w:numPr>
+        <w:spacing w:after="30" w:before="30"/>
+      </w:pPr>
+      <w:r>
+        <w:rPr>
+          <w:rFonts w:ascii="Noto Serif JP" w:cs="Noto Serif JP" w:eastAsia="Noto Serif JP" w:hAnsi="Noto Serif JP"/>
+          <w:color w:val="1A1A1A"/>
+          <w:sz w:val="22"/>
+          <w:szCs w:val="22"/>
+        </w:rPr>
+        <w:t xml:space="preserve">訴訟動向を継続ウォッチし、必要時は方針転換できる柔軟性を保つ</w:t>
+      </w:r>
+    </w:p>
+    <w:p>
+      <w:pPr>
+        <w:pStyle w:val="ListParagraph"/>
+        <w:numPr>
+          <w:ilvl w:val="0"/>
+          <w:numId w:val="2"/>
+        </w:numPr>
+        <w:spacing w:after="30" w:before="30"/>
+      </w:pPr>
+      <w:r>
+        <w:rPr>
+          <w:rFonts w:ascii="Noto Serif JP" w:cs="Noto Serif JP" w:eastAsia="Noto Serif JP" w:hAnsi="Noto Serif JP"/>
+          <w:color w:val="1A1A1A"/>
+          <w:sz w:val="22"/>
+          <w:szCs w:val="22"/>
+        </w:rPr>
+        <w:t xml:space="preserve">クリエイターには「自分が使うツールの規約は自分で確認すべき」と明示</w:t>
+      </w:r>
+    </w:p>
+    <w:p>
+      <w:pPr>
+        <w:pStyle w:val="Heading2"/>
+        <w:spacing w:after="140" w:before="280"/>
+      </w:pPr>
+      <w:r>
+        <w:rPr>
+          <w:rFonts w:ascii="Noto Serif JP" w:cs="Noto Serif JP" w:eastAsia="Noto Serif JP" w:hAnsi="Noto Serif JP"/>
+          <w:b/>
+          <w:bCs/>
+          <w:color w:val="1A1A1A"/>
+          <w:sz w:val="26"/>
+          <w:szCs w:val="26"/>
+        </w:rPr>
+        <w:t xml:space="preserve">10.7 文書体系</w:t>
+      </w:r>
+    </w:p>
+    <w:p>
+      <w:pPr>
+        <w:spacing w:after="60" w:before="60"/>
+      </w:pPr>
+      <w:r>
+        <w:rPr>
+          <w:rFonts w:ascii="Noto Serif JP" w:cs="Noto Serif JP" w:eastAsia="Noto Serif JP" w:hAnsi="Noto Serif JP"/>
+          <w:b w:val="false"/>
+          <w:bCs w:val="false"/>
+          <w:i w:val="false"/>
+          <w:iCs w:val="false"/>
+          <w:color w:val="1A1A1A"/>
+          <w:sz w:val="22"/>
+          <w:szCs w:val="22"/>
+        </w:rPr>
+        <w:t xml:space="preserve">Sotto. が用意すべき法的文書：</w:t>
+      </w:r>
+    </w:p>
+    <w:p>
+      <w:pPr>
+        <w:spacing w:after="60" w:before="60"/>
+      </w:pPr>
+      <w:r>
+        <w:rPr>
+          <w:rFonts w:ascii="Noto Serif JP" w:cs="Noto Serif JP" w:eastAsia="Noto Serif JP" w:hAnsi="Noto Serif JP"/>
+          <w:b w:val="false"/>
+          <w:bCs w:val="false"/>
+          <w:i w:val="false"/>
+          <w:iCs w:val="false"/>
+          <w:color w:val="1A1A1A"/>
+          <w:sz w:val="22"/>
+          <w:szCs w:val="22"/>
+        </w:rPr>
+        <w:t xml:space="preserve"/>
+      </w:r>
+    </w:p>
+    <w:tbl>
+      <w:tblPr>
+        <w:tblW w:type="dxa" w:w="9300"/>
+        <w:tblBorders>
+          <w:top w:val="single" w:color="auto" w:sz="4"/>
+          <w:left w:val="single" w:color="auto" w:sz="4"/>
+          <w:bottom w:val="single" w:color="auto" w:sz="4"/>
+          <w:right w:val="single" w:color="auto" w:sz="4"/>
+          <w:insideH w:val="single" w:color="auto" w:sz="4"/>
+          <w:insideV w:val="single" w:color="auto" w:sz="4"/>
+        </w:tblBorders>
+      </w:tblPr>
+      <w:tblGrid>
+        <w:gridCol w:w="2700"/>
+        <w:gridCol w:w="2400"/>
+        <w:gridCol w:w="4200"/>
+      </w:tblGrid>
+      <w:tr>
+        <w:tc>
+          <w:tcPr>
+            <w:tcW w:type="dxa" w:w="2700"/>
+            <w:tcBorders>
+              <w:top w:val="single" w:color="D8D2C6" w:sz="4"/>
+              <w:left w:val="single" w:color="D8D2C6" w:sz="4"/>
+              <w:bottom w:val="single" w:color="D8D2C6" w:sz="4"/>
+              <w:right w:val="single" w:color="D8D2C6" w:sz="4"/>
+            </w:tcBorders>
+            <w:shd w:fill="FAF5EB" w:val="clear"/>
+            <w:tcMar>
+              <w:top w:type="dxa" w:w="90"/>
+              <w:left w:type="dxa" w:w="130"/>
+              <w:bottom w:type="dxa" w:w="90"/>
+              <w:right w:type="dxa" w:w="130"/>
+            </w:tcMar>
+          </w:tcPr>
+          <w:p>
+            <w:pPr>
+              <w:spacing w:after="0" w:before="0"/>
+            </w:pPr>
+            <w:r>
+              <w:rPr>
+                <w:rFonts w:ascii="Noto Serif JP" w:cs="Noto Serif JP" w:eastAsia="Noto Serif JP" w:hAnsi="Noto Serif JP"/>
+                <w:b/>
+                <w:bCs/>
+                <w:color w:val="1A1A1A"/>
+                <w:sz w:val="20"/>
+                <w:szCs w:val="20"/>
+              </w:rPr>
+              <w:t xml:space="preserve">文書</w:t>
+            </w:r>
+          </w:p>
+        </w:tc>
+        <w:tc>
+          <w:tcPr>
+            <w:tcW w:type="dxa" w:w="2400"/>
+            <w:tcBorders>
+              <w:top w:val="single" w:color="D8D2C6" w:sz="4"/>
+              <w:left w:val="single" w:color="D8D2C6" w:sz="4"/>
+              <w:bottom w:val="single" w:color="D8D2C6" w:sz="4"/>
+              <w:right w:val="single" w:color="D8D2C6" w:sz="4"/>
+            </w:tcBorders>
+            <w:shd w:fill="FAF5EB" w:val="clear"/>
+            <w:tcMar>
+              <w:top w:type="dxa" w:w="90"/>
+              <w:left w:type="dxa" w:w="130"/>
+              <w:bottom w:type="dxa" w:w="90"/>
+              <w:right w:type="dxa" w:w="130"/>
+            </w:tcMar>
+          </w:tcPr>
+          <w:p>
+            <w:pPr>
+              <w:spacing w:after="0" w:before="0"/>
+            </w:pPr>
+            <w:r>
+              <w:rPr>
+                <w:rFonts w:ascii="Noto Serif JP" w:cs="Noto Serif JP" w:eastAsia="Noto Serif JP" w:hAnsi="Noto Serif JP"/>
+                <w:b/>
+                <w:bCs/>
+                <w:color w:val="1A1A1A"/>
+                <w:sz w:val="20"/>
+                <w:szCs w:val="20"/>
+              </w:rPr>
+              <w:t xml:space="preserve">対象</w:t>
+            </w:r>
+          </w:p>
+        </w:tc>
+        <w:tc>
+          <w:tcPr>
+            <w:tcW w:type="dxa" w:w="4200"/>
+            <w:tcBorders>
+              <w:top w:val="single" w:color="D8D2C6" w:sz="4"/>
+              <w:left w:val="single" w:color="D8D2C6" w:sz="4"/>
+              <w:bottom w:val="single" w:color="D8D2C6" w:sz="4"/>
+              <w:right w:val="single" w:color="D8D2C6" w:sz="4"/>
+            </w:tcBorders>
+            <w:shd w:fill="FAF5EB" w:val="clear"/>
+            <w:tcMar>
+              <w:top w:type="dxa" w:w="90"/>
+              <w:left w:type="dxa" w:w="130"/>
+              <w:bottom w:type="dxa" w:w="90"/>
+              <w:right w:type="dxa" w:w="130"/>
+            </w:tcMar>
+          </w:tcPr>
+          <w:p>
+            <w:pPr>
+              <w:spacing w:after="0" w:before="0"/>
+            </w:pPr>
+            <w:r>
+              <w:rPr>
+                <w:rFonts w:ascii="Noto Serif JP" w:cs="Noto Serif JP" w:eastAsia="Noto Serif JP" w:hAnsi="Noto Serif JP"/>
+                <w:b/>
+                <w:bCs/>
+                <w:color w:val="1A1A1A"/>
+                <w:sz w:val="20"/>
+                <w:szCs w:val="20"/>
+              </w:rPr>
+              <w:t xml:space="preserve">公開時期</w:t>
+            </w:r>
+          </w:p>
+        </w:tc>
+      </w:tr>
+      <w:tr>
+        <w:tc>
+          <w:tcPr>
+            <w:tcW w:type="dxa" w:w="2700"/>
+            <w:tcBorders>
+              <w:top w:val="single" w:color="D8D2C6" w:sz="4"/>
+              <w:left w:val="single" w:color="D8D2C6" w:sz="4"/>
+              <w:bottom w:val="single" w:color="D8D2C6" w:sz="4"/>
+              <w:right w:val="single" w:color="D8D2C6" w:sz="4"/>
+            </w:tcBorders>
+            <w:tcMar>
+              <w:top w:type="dxa" w:w="90"/>
+              <w:left w:type="dxa" w:w="130"/>
+              <w:bottom w:type="dxa" w:w="90"/>
+              <w:right w:type="dxa" w:w="130"/>
+            </w:tcMar>
+          </w:tcPr>
+          <w:p>
+            <w:pPr>
+              <w:spacing w:after="0" w:before="0"/>
+            </w:pPr>
+            <w:r>
+              <w:rPr>
+                <w:rFonts w:ascii="Noto Serif JP" w:cs="Noto Serif JP" w:eastAsia="Noto Serif JP" w:hAnsi="Noto Serif JP"/>
+                <w:b w:val="false"/>
+                <w:bCs w:val="false"/>
+                <w:color w:val="1A1A1A"/>
+                <w:sz w:val="20"/>
+                <w:szCs w:val="20"/>
+              </w:rPr>
+              <w:t xml:space="preserve">利用規約（クリエイター向け）</w:t>
+            </w:r>
+          </w:p>
+        </w:tc>
+        <w:tc>
+          <w:tcPr>
+            <w:tcW w:type="dxa" w:w="2400"/>
+            <w:tcBorders>
+              <w:top w:val="single" w:color="D8D2C6" w:sz="4"/>
+              <w:left w:val="single" w:color="D8D2C6" w:sz="4"/>
+              <w:bottom w:val="single" w:color="D8D2C6" w:sz="4"/>
+              <w:right w:val="single" w:color="D8D2C6" w:sz="4"/>
+            </w:tcBorders>
+            <w:tcMar>
+              <w:top w:type="dxa" w:w="90"/>
+              <w:left w:type="dxa" w:w="130"/>
+              <w:bottom w:type="dxa" w:w="90"/>
+              <w:right w:type="dxa" w:w="130"/>
+            </w:tcMar>
+          </w:tcPr>
+          <w:p>
+            <w:pPr>
+              <w:spacing w:after="0" w:before="0"/>
+            </w:pPr>
+            <w:r>
+              <w:rPr>
+                <w:rFonts w:ascii="Noto Serif JP" w:cs="Noto Serif JP" w:eastAsia="Noto Serif JP" w:hAnsi="Noto Serif JP"/>
+                <w:b w:val="false"/>
+                <w:bCs w:val="false"/>
+                <w:color w:val="1A1A1A"/>
+                <w:sz w:val="20"/>
+                <w:szCs w:val="20"/>
+              </w:rPr>
+              <w:t xml:space="preserve">投稿者</w:t>
+            </w:r>
+          </w:p>
+        </w:tc>
+        <w:tc>
+          <w:tcPr>
+            <w:tcW w:type="dxa" w:w="4200"/>
+            <w:tcBorders>
+              <w:top w:val="single" w:color="D8D2C6" w:sz="4"/>
+              <w:left w:val="single" w:color="D8D2C6" w:sz="4"/>
+              <w:bottom w:val="single" w:color="D8D2C6" w:sz="4"/>
+              <w:right w:val="single" w:color="D8D2C6" w:sz="4"/>
+            </w:tcBorders>
+            <w:tcMar>
+              <w:top w:type="dxa" w:w="90"/>
+              <w:left w:type="dxa" w:w="130"/>
+              <w:bottom w:type="dxa" w:w="90"/>
+              <w:right w:type="dxa" w:w="130"/>
+            </w:tcMar>
+          </w:tcPr>
+          <w:p>
+            <w:pPr>
+              <w:spacing w:after="0" w:before="0"/>
+            </w:pPr>
+            <w:r>
+              <w:rPr>
+                <w:rFonts w:ascii="Noto Serif JP" w:cs="Noto Serif JP" w:eastAsia="Noto Serif JP" w:hAnsi="Noto Serif JP"/>
+                <w:b w:val="false"/>
+                <w:bCs w:val="false"/>
+                <w:color w:val="1A1A1A"/>
+                <w:sz w:val="20"/>
+                <w:szCs w:val="20"/>
+              </w:rPr>
+              <w:t xml:space="preserve">Phase 1.x 中（必須）</w:t>
+            </w:r>
+          </w:p>
+        </w:tc>
+      </w:tr>
+      <w:tr>
+        <w:tc>
+          <w:tcPr>
+            <w:tcW w:type="dxa" w:w="2700"/>
+            <w:tcBorders>
+              <w:top w:val="single" w:color="D8D2C6" w:sz="4"/>
+              <w:left w:val="single" w:color="D8D2C6" w:sz="4"/>
+              <w:bottom w:val="single" w:color="D8D2C6" w:sz="4"/>
+              <w:right w:val="single" w:color="D8D2C6" w:sz="4"/>
+            </w:tcBorders>
+            <w:tcMar>
+              <w:top w:type="dxa" w:w="90"/>
+              <w:left w:type="dxa" w:w="130"/>
+              <w:bottom w:type="dxa" w:w="90"/>
+              <w:right w:type="dxa" w:w="130"/>
+            </w:tcMar>
+          </w:tcPr>
+          <w:p>
+            <w:pPr>
+              <w:spacing w:after="0" w:before="0"/>
+            </w:pPr>
+            <w:r>
+              <w:rPr>
+                <w:rFonts w:ascii="Noto Serif JP" w:cs="Noto Serif JP" w:eastAsia="Noto Serif JP" w:hAnsi="Noto Serif JP"/>
+                <w:b w:val="false"/>
+                <w:bCs w:val="false"/>
+                <w:color w:val="1A1A1A"/>
+                <w:sz w:val="20"/>
+                <w:szCs w:val="20"/>
+              </w:rPr>
+              <w:t xml:space="preserve">プライバシーポリシー</w:t>
+            </w:r>
+          </w:p>
+        </w:tc>
+        <w:tc>
+          <w:tcPr>
+            <w:tcW w:type="dxa" w:w="2400"/>
+            <w:tcBorders>
+              <w:top w:val="single" w:color="D8D2C6" w:sz="4"/>
+              <w:left w:val="single" w:color="D8D2C6" w:sz="4"/>
+              <w:bottom w:val="single" w:color="D8D2C6" w:sz="4"/>
+              <w:right w:val="single" w:color="D8D2C6" w:sz="4"/>
+            </w:tcBorders>
+            <w:tcMar>
+              <w:top w:type="dxa" w:w="90"/>
+              <w:left w:type="dxa" w:w="130"/>
+              <w:bottom w:type="dxa" w:w="90"/>
+              <w:right w:type="dxa" w:w="130"/>
+            </w:tcMar>
+          </w:tcPr>
+          <w:p>
+            <w:pPr>
+              <w:spacing w:after="0" w:before="0"/>
+            </w:pPr>
+            <w:r>
+              <w:rPr>
+                <w:rFonts w:ascii="Noto Serif JP" w:cs="Noto Serif JP" w:eastAsia="Noto Serif JP" w:hAnsi="Noto Serif JP"/>
+                <w:b w:val="false"/>
+                <w:bCs w:val="false"/>
+                <w:color w:val="1A1A1A"/>
+                <w:sz w:val="20"/>
+                <w:szCs w:val="20"/>
+              </w:rPr>
+              <w:t xml:space="preserve">全ユーザー</w:t>
+            </w:r>
+          </w:p>
+        </w:tc>
+        <w:tc>
+          <w:tcPr>
+            <w:tcW w:type="dxa" w:w="4200"/>
+            <w:tcBorders>
+              <w:top w:val="single" w:color="D8D2C6" w:sz="4"/>
+              <w:left w:val="single" w:color="D8D2C6" w:sz="4"/>
+              <w:bottom w:val="single" w:color="D8D2C6" w:sz="4"/>
+              <w:right w:val="single" w:color="D8D2C6" w:sz="4"/>
+            </w:tcBorders>
+            <w:tcMar>
+              <w:top w:type="dxa" w:w="90"/>
+              <w:left w:type="dxa" w:w="130"/>
+              <w:bottom w:type="dxa" w:w="90"/>
+              <w:right w:type="dxa" w:w="130"/>
+            </w:tcMar>
+          </w:tcPr>
+          <w:p>
+            <w:pPr>
+              <w:spacing w:after="0" w:before="0"/>
+            </w:pPr>
+            <w:r>
+              <w:rPr>
+                <w:rFonts w:ascii="Noto Serif JP" w:cs="Noto Serif JP" w:eastAsia="Noto Serif JP" w:hAnsi="Noto Serif JP"/>
+                <w:b w:val="false"/>
+                <w:bCs w:val="false"/>
+                <w:color w:val="1A1A1A"/>
+                <w:sz w:val="20"/>
+                <w:szCs w:val="20"/>
+              </w:rPr>
+              <w:t xml:space="preserve">Phase 1.x 中（必須）</w:t>
+            </w:r>
+          </w:p>
+        </w:tc>
+      </w:tr>
+      <w:tr>
+        <w:tc>
+          <w:tcPr>
+            <w:tcW w:type="dxa" w:w="2700"/>
+            <w:tcBorders>
+              <w:top w:val="single" w:color="D8D2C6" w:sz="4"/>
+              <w:left w:val="single" w:color="D8D2C6" w:sz="4"/>
+              <w:bottom w:val="single" w:color="D8D2C6" w:sz="4"/>
+              <w:right w:val="single" w:color="D8D2C6" w:sz="4"/>
+            </w:tcBorders>
+            <w:tcMar>
+              <w:top w:type="dxa" w:w="90"/>
+              <w:left w:type="dxa" w:w="130"/>
+              <w:bottom w:type="dxa" w:w="90"/>
+              <w:right w:type="dxa" w:w="130"/>
+            </w:tcMar>
+          </w:tcPr>
+          <w:p>
+            <w:pPr>
+              <w:spacing w:after="0" w:before="0"/>
+            </w:pPr>
+            <w:r>
+              <w:rPr>
+                <w:rFonts w:ascii="Noto Serif JP" w:cs="Noto Serif JP" w:eastAsia="Noto Serif JP" w:hAnsi="Noto Serif JP"/>
+                <w:b w:val="false"/>
+                <w:bCs w:val="false"/>
+                <w:color w:val="1A1A1A"/>
+                <w:sz w:val="20"/>
+                <w:szCs w:val="20"/>
+              </w:rPr>
+              <w:t xml:space="preserve">特定商取引法表記</w:t>
+            </w:r>
+          </w:p>
+        </w:tc>
+        <w:tc>
+          <w:tcPr>
+            <w:tcW w:type="dxa" w:w="2400"/>
+            <w:tcBorders>
+              <w:top w:val="single" w:color="D8D2C6" w:sz="4"/>
+              <w:left w:val="single" w:color="D8D2C6" w:sz="4"/>
+              <w:bottom w:val="single" w:color="D8D2C6" w:sz="4"/>
+              <w:right w:val="single" w:color="D8D2C6" w:sz="4"/>
+            </w:tcBorders>
+            <w:tcMar>
+              <w:top w:type="dxa" w:w="90"/>
+              <w:left w:type="dxa" w:w="130"/>
+              <w:bottom w:type="dxa" w:w="90"/>
+              <w:right w:type="dxa" w:w="130"/>
+            </w:tcMar>
+          </w:tcPr>
+          <w:p>
+            <w:pPr>
+              <w:spacing w:after="0" w:before="0"/>
+            </w:pPr>
+            <w:r>
+              <w:rPr>
+                <w:rFonts w:ascii="Noto Serif JP" w:cs="Noto Serif JP" w:eastAsia="Noto Serif JP" w:hAnsi="Noto Serif JP"/>
+                <w:b w:val="false"/>
+                <w:bCs w:val="false"/>
+                <w:color w:val="1A1A1A"/>
+                <w:sz w:val="20"/>
+                <w:szCs w:val="20"/>
+              </w:rPr>
+              <w:t xml:space="preserve">有料サービス</w:t>
+            </w:r>
+          </w:p>
+        </w:tc>
+        <w:tc>
+          <w:tcPr>
+            <w:tcW w:type="dxa" w:w="4200"/>
+            <w:tcBorders>
+              <w:top w:val="single" w:color="D8D2C6" w:sz="4"/>
+              <w:left w:val="single" w:color="D8D2C6" w:sz="4"/>
+              <w:bottom w:val="single" w:color="D8D2C6" w:sz="4"/>
+              <w:right w:val="single" w:color="D8D2C6" w:sz="4"/>
+            </w:tcBorders>
+            <w:tcMar>
+              <w:top w:type="dxa" w:w="90"/>
+              <w:left w:type="dxa" w:w="130"/>
+              <w:bottom w:type="dxa" w:w="90"/>
+              <w:right w:type="dxa" w:w="130"/>
+            </w:tcMar>
+          </w:tcPr>
+          <w:p>
+            <w:pPr>
+              <w:spacing w:after="0" w:before="0"/>
+            </w:pPr>
+            <w:r>
+              <w:rPr>
+                <w:rFonts w:ascii="Noto Serif JP" w:cs="Noto Serif JP" w:eastAsia="Noto Serif JP" w:hAnsi="Noto Serif JP"/>
+                <w:b w:val="false"/>
+                <w:bCs w:val="false"/>
+                <w:color w:val="1A1A1A"/>
+                <w:sz w:val="20"/>
+                <w:szCs w:val="20"/>
+              </w:rPr>
+              <w:t xml:space="preserve">Phase 1.5 課金開始前</w:t>
+            </w:r>
+          </w:p>
+        </w:tc>
+      </w:tr>
+      <w:tr>
+        <w:tc>
+          <w:tcPr>
+            <w:tcW w:type="dxa" w:w="2700"/>
+            <w:tcBorders>
+              <w:top w:val="single" w:color="D8D2C6" w:sz="4"/>
+              <w:left w:val="single" w:color="D8D2C6" w:sz="4"/>
+              <w:bottom w:val="single" w:color="D8D2C6" w:sz="4"/>
+              <w:right w:val="single" w:color="D8D2C6" w:sz="4"/>
+            </w:tcBorders>
+            <w:tcMar>
+              <w:top w:type="dxa" w:w="90"/>
+              <w:left w:type="dxa" w:w="130"/>
+              <w:bottom w:type="dxa" w:w="90"/>
+              <w:right w:type="dxa" w:w="130"/>
+            </w:tcMar>
+          </w:tcPr>
+          <w:p>
+            <w:pPr>
+              <w:spacing w:after="0" w:before="0"/>
+            </w:pPr>
+            <w:r>
+              <w:rPr>
+                <w:rFonts w:ascii="Noto Serif JP" w:cs="Noto Serif JP" w:eastAsia="Noto Serif JP" w:hAnsi="Noto Serif JP"/>
+                <w:b w:val="false"/>
+                <w:bCs w:val="false"/>
+                <w:color w:val="1A1A1A"/>
+                <w:sz w:val="20"/>
+                <w:szCs w:val="20"/>
+              </w:rPr>
+              <w:t xml:space="preserve">Sotto Spaces 利用契約</w:t>
+            </w:r>
+          </w:p>
+        </w:tc>
+        <w:tc>
+          <w:tcPr>
+            <w:tcW w:type="dxa" w:w="2400"/>
+            <w:tcBorders>
+              <w:top w:val="single" w:color="D8D2C6" w:sz="4"/>
+              <w:left w:val="single" w:color="D8D2C6" w:sz="4"/>
+              <w:bottom w:val="single" w:color="D8D2C6" w:sz="4"/>
+              <w:right w:val="single" w:color="D8D2C6" w:sz="4"/>
+            </w:tcBorders>
+            <w:tcMar>
+              <w:top w:type="dxa" w:w="90"/>
+              <w:left w:type="dxa" w:w="130"/>
+              <w:bottom w:type="dxa" w:w="90"/>
+              <w:right w:type="dxa" w:w="130"/>
+            </w:tcMar>
+          </w:tcPr>
+          <w:p>
+            <w:pPr>
+              <w:spacing w:after="0" w:before="0"/>
+            </w:pPr>
+            <w:r>
+              <w:rPr>
+                <w:rFonts w:ascii="Noto Serif JP" w:cs="Noto Serif JP" w:eastAsia="Noto Serif JP" w:hAnsi="Noto Serif JP"/>
+                <w:b w:val="false"/>
+                <w:bCs w:val="false"/>
+                <w:color w:val="1A1A1A"/>
+                <w:sz w:val="20"/>
+                <w:szCs w:val="20"/>
+              </w:rPr>
+              <w:t xml:space="preserve">店舗オーナー</w:t>
+            </w:r>
+          </w:p>
+        </w:tc>
+        <w:tc>
+          <w:tcPr>
+            <w:tcW w:type="dxa" w:w="4200"/>
+            <w:tcBorders>
+              <w:top w:val="single" w:color="D8D2C6" w:sz="4"/>
+              <w:left w:val="single" w:color="D8D2C6" w:sz="4"/>
+              <w:bottom w:val="single" w:color="D8D2C6" w:sz="4"/>
+              <w:right w:val="single" w:color="D8D2C6" w:sz="4"/>
+            </w:tcBorders>
+            <w:tcMar>
+              <w:top w:type="dxa" w:w="90"/>
+              <w:left w:type="dxa" w:w="130"/>
+              <w:bottom w:type="dxa" w:w="90"/>
+              <w:right w:type="dxa" w:w="130"/>
+            </w:tcMar>
+          </w:tcPr>
+          <w:p>
+            <w:pPr>
+              <w:spacing w:after="0" w:before="0"/>
+            </w:pPr>
+            <w:r>
+              <w:rPr>
+                <w:rFonts w:ascii="Noto Serif JP" w:cs="Noto Serif JP" w:eastAsia="Noto Serif JP" w:hAnsi="Noto Serif JP"/>
+                <w:b w:val="false"/>
+                <w:bCs w:val="false"/>
+                <w:color w:val="1A1A1A"/>
+                <w:sz w:val="20"/>
+                <w:szCs w:val="20"/>
+              </w:rPr>
+              <w:t xml:space="preserve">Phase 2.3 募集ボード公開時</w:t>
+            </w:r>
+          </w:p>
+        </w:tc>
+      </w:tr>
+      <w:tr>
+        <w:tc>
+          <w:tcPr>
+            <w:tcW w:type="dxa" w:w="2700"/>
+            <w:tcBorders>
+              <w:top w:val="single" w:color="D8D2C6" w:sz="4"/>
+              <w:left w:val="single" w:color="D8D2C6" w:sz="4"/>
+              <w:bottom w:val="single" w:color="D8D2C6" w:sz="4"/>
+              <w:right w:val="single" w:color="D8D2C6" w:sz="4"/>
+            </w:tcBorders>
+            <w:tcMar>
+              <w:top w:type="dxa" w:w="90"/>
+              <w:left w:type="dxa" w:w="130"/>
+              <w:bottom w:type="dxa" w:w="90"/>
+              <w:right w:type="dxa" w:w="130"/>
+            </w:tcMar>
+          </w:tcPr>
+          <w:p>
+            <w:pPr>
+              <w:spacing w:after="0" w:before="0"/>
+            </w:pPr>
+            <w:r>
+              <w:rPr>
+                <w:rFonts w:ascii="Noto Serif JP" w:cs="Noto Serif JP" w:eastAsia="Noto Serif JP" w:hAnsi="Noto Serif JP"/>
+                <w:b w:val="false"/>
+                <w:bCs w:val="false"/>
+                <w:color w:val="1A1A1A"/>
+                <w:sz w:val="20"/>
+                <w:szCs w:val="20"/>
+              </w:rPr>
+              <w:t xml:space="preserve">クリエイターロイヤリティ契約</w:t>
+            </w:r>
+          </w:p>
+        </w:tc>
+        <w:tc>
+          <w:tcPr>
+            <w:tcW w:type="dxa" w:w="2400"/>
+            <w:tcBorders>
+              <w:top w:val="single" w:color="D8D2C6" w:sz="4"/>
+              <w:left w:val="single" w:color="D8D2C6" w:sz="4"/>
+              <w:bottom w:val="single" w:color="D8D2C6" w:sz="4"/>
+              <w:right w:val="single" w:color="D8D2C6" w:sz="4"/>
+            </w:tcBorders>
+            <w:tcMar>
+              <w:top w:type="dxa" w:w="90"/>
+              <w:left w:type="dxa" w:w="130"/>
+              <w:bottom w:type="dxa" w:w="90"/>
+              <w:right w:type="dxa" w:w="130"/>
+            </w:tcMar>
+          </w:tcPr>
+          <w:p>
+            <w:pPr>
+              <w:spacing w:after="0" w:before="0"/>
+            </w:pPr>
+            <w:r>
+              <w:rPr>
+                <w:rFonts w:ascii="Noto Serif JP" w:cs="Noto Serif JP" w:eastAsia="Noto Serif JP" w:hAnsi="Noto Serif JP"/>
+                <w:b w:val="false"/>
+                <w:bCs w:val="false"/>
+                <w:color w:val="1A1A1A"/>
+                <w:sz w:val="20"/>
+                <w:szCs w:val="20"/>
+              </w:rPr>
+              <w:t xml:space="preserve">採用クリエイター</w:t>
+            </w:r>
+          </w:p>
+        </w:tc>
+        <w:tc>
+          <w:tcPr>
+            <w:tcW w:type="dxa" w:w="4200"/>
+            <w:tcBorders>
+              <w:top w:val="single" w:color="D8D2C6" w:sz="4"/>
+              <w:left w:val="single" w:color="D8D2C6" w:sz="4"/>
+              <w:bottom w:val="single" w:color="D8D2C6" w:sz="4"/>
+              <w:right w:val="single" w:color="D8D2C6" w:sz="4"/>
+            </w:tcBorders>
+            <w:tcMar>
+              <w:top w:type="dxa" w:w="90"/>
+              <w:left w:type="dxa" w:w="130"/>
+              <w:bottom w:type="dxa" w:w="90"/>
+              <w:right w:type="dxa" w:w="130"/>
+            </w:tcMar>
+          </w:tcPr>
+          <w:p>
+            <w:pPr>
+              <w:spacing w:after="0" w:before="0"/>
+            </w:pPr>
+            <w:r>
+              <w:rPr>
+                <w:rFonts w:ascii="Noto Serif JP" w:cs="Noto Serif JP" w:eastAsia="Noto Serif JP" w:hAnsi="Noto Serif JP"/>
+                <w:b w:val="false"/>
+                <w:bCs w:val="false"/>
+                <w:color w:val="1A1A1A"/>
+                <w:sz w:val="20"/>
+                <w:szCs w:val="20"/>
+              </w:rPr>
+              <w:t xml:space="preserve">Phase 2.5 報酬分配開始時</w:t>
+            </w:r>
+          </w:p>
+        </w:tc>
+      </w:tr>
+      <w:tr>
+        <w:tc>
+          <w:tcPr>
+            <w:tcW w:type="dxa" w:w="2700"/>
+            <w:tcBorders>
+              <w:top w:val="single" w:color="D8D2C6" w:sz="4"/>
+              <w:left w:val="single" w:color="D8D2C6" w:sz="4"/>
+              <w:bottom w:val="single" w:color="D8D2C6" w:sz="4"/>
+              <w:right w:val="single" w:color="D8D2C6" w:sz="4"/>
+            </w:tcBorders>
+            <w:tcMar>
+              <w:top w:type="dxa" w:w="90"/>
+              <w:left w:type="dxa" w:w="130"/>
+              <w:bottom w:type="dxa" w:w="90"/>
+              <w:right w:type="dxa" w:w="130"/>
+            </w:tcMar>
+          </w:tcPr>
+          <w:p>
+            <w:pPr>
+              <w:spacing w:after="0" w:before="0"/>
+            </w:pPr>
+            <w:r>
+              <w:rPr>
+                <w:rFonts w:ascii="Noto Serif JP" w:cs="Noto Serif JP" w:eastAsia="Noto Serif JP" w:hAnsi="Noto Serif JP"/>
+                <w:b w:val="false"/>
+                <w:bCs w:val="false"/>
+                <w:color w:val="1A1A1A"/>
+                <w:sz w:val="20"/>
+                <w:szCs w:val="20"/>
+              </w:rPr>
+              <w:t xml:space="preserve">DMCA / 削除申請ガイドライン</w:t>
+            </w:r>
+          </w:p>
+        </w:tc>
+        <w:tc>
+          <w:tcPr>
+            <w:tcW w:type="dxa" w:w="2400"/>
+            <w:tcBorders>
+              <w:top w:val="single" w:color="D8D2C6" w:sz="4"/>
+              <w:left w:val="single" w:color="D8D2C6" w:sz="4"/>
+              <w:bottom w:val="single" w:color="D8D2C6" w:sz="4"/>
+              <w:right w:val="single" w:color="D8D2C6" w:sz="4"/>
+            </w:tcBorders>
+            <w:tcMar>
+              <w:top w:type="dxa" w:w="90"/>
+              <w:left w:type="dxa" w:w="130"/>
+              <w:bottom w:type="dxa" w:w="90"/>
+              <w:right w:type="dxa" w:w="130"/>
+            </w:tcMar>
+          </w:tcPr>
+          <w:p>
+            <w:pPr>
+              <w:spacing w:after="0" w:before="0"/>
+            </w:pPr>
+            <w:r>
+              <w:rPr>
+                <w:rFonts w:ascii="Noto Serif JP" w:cs="Noto Serif JP" w:eastAsia="Noto Serif JP" w:hAnsi="Noto Serif JP"/>
+                <w:b w:val="false"/>
+                <w:bCs w:val="false"/>
+                <w:color w:val="1A1A1A"/>
+                <w:sz w:val="20"/>
+                <w:szCs w:val="20"/>
+              </w:rPr>
+              <w:t xml:space="preserve">第三者権利者</w:t>
+            </w:r>
+          </w:p>
+        </w:tc>
+        <w:tc>
+          <w:tcPr>
+            <w:tcW w:type="dxa" w:w="4200"/>
+            <w:tcBorders>
+              <w:top w:val="single" w:color="D8D2C6" w:sz="4"/>
+              <w:left w:val="single" w:color="D8D2C6" w:sz="4"/>
+              <w:bottom w:val="single" w:color="D8D2C6" w:sz="4"/>
+              <w:right w:val="single" w:color="D8D2C6" w:sz="4"/>
+            </w:tcBorders>
+            <w:tcMar>
+              <w:top w:type="dxa" w:w="90"/>
+              <w:left w:type="dxa" w:w="130"/>
+              <w:bottom w:type="dxa" w:w="90"/>
+              <w:right w:type="dxa" w:w="130"/>
+            </w:tcMar>
+          </w:tcPr>
+          <w:p>
+            <w:pPr>
+              <w:spacing w:after="0" w:before="0"/>
+            </w:pPr>
+            <w:r>
+              <w:rPr>
+                <w:rFonts w:ascii="Noto Serif JP" w:cs="Noto Serif JP" w:eastAsia="Noto Serif JP" w:hAnsi="Noto Serif JP"/>
+                <w:b w:val="false"/>
+                <w:bCs w:val="false"/>
+                <w:color w:val="1A1A1A"/>
+                <w:sz w:val="20"/>
+                <w:szCs w:val="20"/>
+              </w:rPr>
+              <w:t xml:space="preserve">Phase 1.x 中</w:t>
+            </w:r>
+          </w:p>
+        </w:tc>
+      </w:tr>
+    </w:tbl>
+    <w:p>
+      <w:pPr>
+        <w:pStyle w:val="Heading2"/>
+        <w:spacing w:after="140" w:before="280"/>
+      </w:pPr>
+      <w:r>
+        <w:rPr>
+          <w:rFonts w:ascii="Noto Serif JP" w:cs="Noto Serif JP" w:eastAsia="Noto Serif JP" w:hAnsi="Noto Serif JP"/>
+          <w:b/>
+          <w:bCs/>
+          <w:color w:val="1A1A1A"/>
+          <w:sz w:val="26"/>
+          <w:szCs w:val="26"/>
+        </w:rPr>
+        <w:t xml:space="preserve">10.8 弁護士・専門家の確保</w:t>
+      </w:r>
+    </w:p>
+    <w:p>
+      <w:pPr>
+        <w:spacing w:after="60" w:before="60"/>
+      </w:pPr>
+      <w:r>
+        <w:rPr>
+          <w:rFonts w:ascii="Noto Serif JP" w:cs="Noto Serif JP" w:eastAsia="Noto Serif JP" w:hAnsi="Noto Serif JP"/>
+          <w:b w:val="false"/>
+          <w:bCs w:val="false"/>
+          <w:i w:val="false"/>
+          <w:iCs w:val="false"/>
+          <w:color w:val="1A1A1A"/>
+          <w:sz w:val="22"/>
+          <w:szCs w:val="22"/>
+        </w:rPr>
+        <w:t xml:space="preserve">Phase 2.5（収益分配）開始前に、以下の専門家との関係を構築する：</w:t>
+      </w:r>
+    </w:p>
+    <w:p>
+      <w:pPr>
+        <w:spacing w:after="60" w:before="60"/>
+      </w:pPr>
+      <w:r>
+        <w:rPr>
+          <w:rFonts w:ascii="Noto Serif JP" w:cs="Noto Serif JP" w:eastAsia="Noto Serif JP" w:hAnsi="Noto Serif JP"/>
+          <w:b w:val="false"/>
+          <w:bCs w:val="false"/>
+          <w:i w:val="false"/>
+          <w:iCs w:val="false"/>
+          <w:color w:val="1A1A1A"/>
+          <w:sz w:val="22"/>
+          <w:szCs w:val="22"/>
+        </w:rPr>
+        <w:t xml:space="preserve"/>
+      </w:r>
+    </w:p>
+    <w:p>
+      <w:pPr>
+        <w:pStyle w:val="ListParagraph"/>
+        <w:numPr>
+          <w:ilvl w:val="0"/>
+          <w:numId w:val="2"/>
+        </w:numPr>
+        <w:spacing w:after="30" w:before="30"/>
+      </w:pPr>
+      <w:r>
+        <w:rPr>
+          <w:rFonts w:ascii="Noto Serif JP" w:cs="Noto Serif JP" w:eastAsia="Noto Serif JP" w:hAnsi="Noto Serif JP"/>
+          <w:color w:val="1A1A1A"/>
+          <w:sz w:val="22"/>
+          <w:szCs w:val="22"/>
+        </w:rPr>
+        <w:t xml:space="preserve">IT・エンタメ専門の顧問弁護士（1名・月額顧問契約 ¥30,000〜）</w:t>
+      </w:r>
+    </w:p>
+    <w:p>
+      <w:pPr>
+        <w:pStyle w:val="ListParagraph"/>
+        <w:numPr>
+          <w:ilvl w:val="0"/>
+          <w:numId w:val="2"/>
+        </w:numPr>
+        <w:spacing w:after="30" w:before="30"/>
+      </w:pPr>
+      <w:r>
+        <w:rPr>
+          <w:rFonts w:ascii="Noto Serif JP" w:cs="Noto Serif JP" w:eastAsia="Noto Serif JP" w:hAnsi="Noto Serif JP"/>
+          <w:color w:val="1A1A1A"/>
+          <w:sz w:val="22"/>
+          <w:szCs w:val="22"/>
+        </w:rPr>
+        <w:t xml:space="preserve">税理士（インボイス対応・国際支払い対応）</w:t>
+      </w:r>
+    </w:p>
+    <w:p>
+      <w:pPr>
+        <w:pStyle w:val="ListParagraph"/>
+        <w:numPr>
+          <w:ilvl w:val="0"/>
+          <w:numId w:val="2"/>
+        </w:numPr>
+        <w:spacing w:after="30" w:before="30"/>
+      </w:pPr>
+      <w:r>
+        <w:rPr>
+          <w:rFonts w:ascii="Noto Serif JP" w:cs="Noto Serif JP" w:eastAsia="Noto Serif JP" w:hAnsi="Noto Serif JP"/>
+          <w:color w:val="1A1A1A"/>
+          <w:sz w:val="22"/>
+          <w:szCs w:val="22"/>
+        </w:rPr>
+        <w:t xml:space="preserve">社労士（将来の雇用拡大時）</w:t>
+      </w:r>
+    </w:p>
+    <w:p>
+      <w:pPr>
+        <w:pStyle w:val="ListParagraph"/>
+        <w:numPr>
+          <w:ilvl w:val="0"/>
+          <w:numId w:val="2"/>
+        </w:numPr>
+        <w:spacing w:after="30" w:before="30"/>
+      </w:pPr>
+      <w:r>
+        <w:rPr>
+          <w:rFonts w:ascii="Noto Serif JP" w:cs="Noto Serif JP" w:eastAsia="Noto Serif JP" w:hAnsi="Noto Serif JP"/>
+          <w:color w:val="1A1A1A"/>
+          <w:sz w:val="22"/>
+          <w:szCs w:val="22"/>
+        </w:rPr>
+        <w:t xml:space="preserve">保険：プロダクト責任保険・IP 賠償保険</w:t>
+      </w:r>
+    </w:p>
+    <w:p>
+      <w:pPr>
+        <w:spacing w:after="60" w:before="60"/>
+      </w:pPr>
+      <w:r>
+        <w:rPr>
+          <w:rFonts w:ascii="Noto Serif JP" w:cs="Noto Serif JP" w:eastAsia="Noto Serif JP" w:hAnsi="Noto Serif JP"/>
+          <w:b w:val="false"/>
+          <w:bCs w:val="false"/>
+          <w:i w:val="false"/>
+          <w:iCs w:val="false"/>
+          <w:color w:val="1A1A1A"/>
+          <w:sz w:val="22"/>
+          <w:szCs w:val="22"/>
+        </w:rPr>
+        <w:t xml:space="preserve"/>
+      </w:r>
+    </w:p>
+    <w:p>
+      <w:pPr>
+        <w:spacing w:after="60" w:before="60"/>
+      </w:pPr>
+      <w:r>
+        <w:rPr>
+          <w:rFonts w:ascii="Noto Serif JP" w:cs="Noto Serif JP" w:eastAsia="Noto Serif JP" w:hAnsi="Noto Serif JP"/>
+          <w:b w:val="false"/>
+          <w:bCs w:val="false"/>
+          <w:i/>
+          <w:iCs/>
+          <w:color w:val="6E6859"/>
+          <w:sz w:val="22"/>
+          <w:szCs w:val="22"/>
+        </w:rPr>
+        <w:t xml:space="preserve">初期はベンチャー支援に積極的な弁護士事務所のスポット相談（¥10,000-30,000/回）で十分。</w:t>
+      </w:r>
+    </w:p>
+    <w:p>
+      <w:pPr>
+        <w:pStyle w:val="Heading2"/>
+        <w:spacing w:after="140" w:before="280"/>
+      </w:pPr>
+      <w:r>
+        <w:rPr>
+          <w:rFonts w:ascii="Noto Serif JP" w:cs="Noto Serif JP" w:eastAsia="Noto Serif JP" w:hAnsi="Noto Serif JP"/>
+          <w:b/>
+          <w:bCs/>
+          <w:color w:val="1A1A1A"/>
+          <w:sz w:val="26"/>
+          <w:szCs w:val="26"/>
+        </w:rPr>
+        <w:t xml:space="preserve">10.9 ライセンス機能の実装フェーズ</w:t>
+      </w:r>
+    </w:p>
+    <w:tbl>
+      <w:tblPr>
+        <w:tblW w:type="dxa" w:w="9300"/>
+        <w:tblBorders>
+          <w:top w:val="single" w:color="auto" w:sz="4"/>
+          <w:left w:val="single" w:color="auto" w:sz="4"/>
+          <w:bottom w:val="single" w:color="auto" w:sz="4"/>
+          <w:right w:val="single" w:color="auto" w:sz="4"/>
+          <w:insideH w:val="single" w:color="auto" w:sz="4"/>
+          <w:insideV w:val="single" w:color="auto" w:sz="4"/>
+        </w:tblBorders>
+      </w:tblPr>
+      <w:tblGrid>
+        <w:gridCol w:w="1700"/>
+        <w:gridCol w:w="7600"/>
+      </w:tblGrid>
+      <w:tr>
+        <w:tc>
+          <w:tcPr>
+            <w:tcW w:type="dxa" w:w="1700"/>
+            <w:tcBorders>
+              <w:top w:val="single" w:color="D8D2C6" w:sz="4"/>
+              <w:left w:val="single" w:color="D8D2C6" w:sz="4"/>
+              <w:bottom w:val="single" w:color="D8D2C6" w:sz="4"/>
+              <w:right w:val="single" w:color="D8D2C6" w:sz="4"/>
+            </w:tcBorders>
+            <w:shd w:fill="F4F1EC" w:val="clear"/>
+            <w:tcMar>
+              <w:top w:type="dxa" w:w="90"/>
+              <w:left w:type="dxa" w:w="130"/>
+              <w:bottom w:type="dxa" w:w="90"/>
+              <w:right w:type="dxa" w:w="130"/>
+            </w:tcMar>
+          </w:tcPr>
+          <w:p>
+            <w:pPr>
+              <w:spacing w:after="0" w:before="0"/>
+            </w:pPr>
+            <w:r>
+              <w:rPr>
+                <w:rFonts w:ascii="Noto Serif JP" w:cs="Noto Serif JP" w:eastAsia="Noto Serif JP" w:hAnsi="Noto Serif JP"/>
+                <w:b/>
+                <w:bCs/>
+                <w:color w:val="1A1A1A"/>
+                <w:sz w:val="20"/>
+                <w:szCs w:val="20"/>
+              </w:rPr>
+              <w:t xml:space="preserve">Phase 1.x</w:t>
+            </w:r>
+          </w:p>
+        </w:tc>
+        <w:tc>
+          <w:tcPr>
+            <w:tcW w:type="dxa" w:w="7600"/>
+            <w:tcBorders>
+              <w:top w:val="single" w:color="D8D2C6" w:sz="4"/>
+              <w:left w:val="single" w:color="D8D2C6" w:sz="4"/>
+              <w:bottom w:val="single" w:color="D8D2C6" w:sz="4"/>
+              <w:right w:val="single" w:color="D8D2C6" w:sz="4"/>
+            </w:tcBorders>
+            <w:tcMar>
+              <w:top w:type="dxa" w:w="90"/>
+              <w:left w:type="dxa" w:w="130"/>
+              <w:bottom w:type="dxa" w:w="90"/>
+              <w:right w:type="dxa" w:w="130"/>
+            </w:tcMar>
+          </w:tcPr>
+          <w:p>
+            <w:pPr>
+              <w:spacing w:after="0" w:before="0"/>
+            </w:pPr>
+            <w:r>
+              <w:rPr>
+                <w:rFonts w:ascii="Noto Serif JP" w:cs="Noto Serif JP" w:eastAsia="Noto Serif JP" w:hAnsi="Noto Serif JP"/>
+                <w:b w:val="false"/>
+                <w:bCs w:val="false"/>
+                <w:color w:val="1A1A1A"/>
+                <w:sz w:val="20"/>
+                <w:szCs w:val="20"/>
+              </w:rPr>
+              <w:t xml:space="preserve">投稿時の保証チェック、ToS / Privacy Policy 公開、メタデータ記録</w:t>
+            </w:r>
+          </w:p>
+        </w:tc>
+      </w:tr>
+      <w:tr>
+        <w:tc>
+          <w:tcPr>
+            <w:tcW w:type="dxa" w:w="1700"/>
+            <w:tcBorders>
+              <w:top w:val="single" w:color="D8D2C6" w:sz="4"/>
+              <w:left w:val="single" w:color="D8D2C6" w:sz="4"/>
+              <w:bottom w:val="single" w:color="D8D2C6" w:sz="4"/>
+              <w:right w:val="single" w:color="D8D2C6" w:sz="4"/>
+            </w:tcBorders>
+            <w:shd w:fill="F4F1EC" w:val="clear"/>
+            <w:tcMar>
+              <w:top w:type="dxa" w:w="90"/>
+              <w:left w:type="dxa" w:w="130"/>
+              <w:bottom w:type="dxa" w:w="90"/>
+              <w:right w:type="dxa" w:w="130"/>
+            </w:tcMar>
+          </w:tcPr>
+          <w:p>
+            <w:pPr>
+              <w:spacing w:after="0" w:before="0"/>
+            </w:pPr>
+            <w:r>
+              <w:rPr>
+                <w:rFonts w:ascii="Noto Serif JP" w:cs="Noto Serif JP" w:eastAsia="Noto Serif JP" w:hAnsi="Noto Serif JP"/>
+                <w:b/>
+                <w:bCs/>
+                <w:color w:val="1A1A1A"/>
+                <w:sz w:val="20"/>
+                <w:szCs w:val="20"/>
+              </w:rPr>
+              <w:t xml:space="preserve">Phase 1.5</w:t>
+            </w:r>
+          </w:p>
+        </w:tc>
+        <w:tc>
+          <w:tcPr>
+            <w:tcW w:type="dxa" w:w="7600"/>
+            <w:tcBorders>
+              <w:top w:val="single" w:color="D8D2C6" w:sz="4"/>
+              <w:left w:val="single" w:color="D8D2C6" w:sz="4"/>
+              <w:bottom w:val="single" w:color="D8D2C6" w:sz="4"/>
+              <w:right w:val="single" w:color="D8D2C6" w:sz="4"/>
+            </w:tcBorders>
+            <w:tcMar>
+              <w:top w:type="dxa" w:w="90"/>
+              <w:left w:type="dxa" w:w="130"/>
+              <w:bottom w:type="dxa" w:w="90"/>
+              <w:right w:type="dxa" w:w="130"/>
+            </w:tcMar>
+          </w:tcPr>
+          <w:p>
+            <w:pPr>
+              <w:spacing w:after="0" w:before="0"/>
+            </w:pPr>
+            <w:r>
+              <w:rPr>
+                <w:rFonts w:ascii="Noto Serif JP" w:cs="Noto Serif JP" w:eastAsia="Noto Serif JP" w:hAnsi="Noto Serif JP"/>
+                <w:b w:val="false"/>
+                <w:bCs w:val="false"/>
+                <w:color w:val="1A1A1A"/>
+                <w:sz w:val="20"/>
+                <w:szCs w:val="20"/>
+              </w:rPr>
+              <w:t xml:space="preserve">特定商取引法表記、Pro 課金規約</w:t>
+            </w:r>
+          </w:p>
+        </w:tc>
+      </w:tr>
+      <w:tr>
+        <w:tc>
+          <w:tcPr>
+            <w:tcW w:type="dxa" w:w="1700"/>
+            <w:tcBorders>
+              <w:top w:val="single" w:color="D8D2C6" w:sz="4"/>
+              <w:left w:val="single" w:color="D8D2C6" w:sz="4"/>
+              <w:bottom w:val="single" w:color="D8D2C6" w:sz="4"/>
+              <w:right w:val="single" w:color="D8D2C6" w:sz="4"/>
+            </w:tcBorders>
+            <w:shd w:fill="F4F1EC" w:val="clear"/>
+            <w:tcMar>
+              <w:top w:type="dxa" w:w="90"/>
+              <w:left w:type="dxa" w:w="130"/>
+              <w:bottom w:type="dxa" w:w="90"/>
+              <w:right w:type="dxa" w:w="130"/>
+            </w:tcMar>
+          </w:tcPr>
+          <w:p>
+            <w:pPr>
+              <w:spacing w:after="0" w:before="0"/>
+            </w:pPr>
+            <w:r>
+              <w:rPr>
+                <w:rFonts w:ascii="Noto Serif JP" w:cs="Noto Serif JP" w:eastAsia="Noto Serif JP" w:hAnsi="Noto Serif JP"/>
+                <w:b/>
+                <w:bCs/>
+                <w:color w:val="1A1A1A"/>
+                <w:sz w:val="20"/>
+                <w:szCs w:val="20"/>
+              </w:rPr>
+              <w:t xml:space="preserve">Phase 2.0</w:t>
+            </w:r>
+          </w:p>
+        </w:tc>
+        <w:tc>
+          <w:tcPr>
+            <w:tcW w:type="dxa" w:w="7600"/>
+            <w:tcBorders>
+              <w:top w:val="single" w:color="D8D2C6" w:sz="4"/>
+              <w:left w:val="single" w:color="D8D2C6" w:sz="4"/>
+              <w:bottom w:val="single" w:color="D8D2C6" w:sz="4"/>
+              <w:right w:val="single" w:color="D8D2C6" w:sz="4"/>
+            </w:tcBorders>
+            <w:tcMar>
+              <w:top w:type="dxa" w:w="90"/>
+              <w:left w:type="dxa" w:w="130"/>
+              <w:bottom w:type="dxa" w:w="90"/>
+              <w:right w:type="dxa" w:w="130"/>
+            </w:tcMar>
+          </w:tcPr>
+          <w:p>
+            <w:pPr>
+              <w:spacing w:after="0" w:before="0"/>
+            </w:pPr>
+            <w:r>
+              <w:rPr>
+                <w:rFonts w:ascii="Noto Serif JP" w:cs="Noto Serif JP" w:eastAsia="Noto Serif JP" w:hAnsi="Noto Serif JP"/>
+                <w:b w:val="false"/>
+                <w:bCs w:val="false"/>
+                <w:color w:val="1A1A1A"/>
+                <w:sz w:val="20"/>
+                <w:szCs w:val="20"/>
+              </w:rPr>
+              <w:t xml:space="preserve">用途タグ宣言＝商用許諾の明示化</w:t>
+            </w:r>
+          </w:p>
+        </w:tc>
+      </w:tr>
+      <w:tr>
+        <w:tc>
+          <w:tcPr>
+            <w:tcW w:type="dxa" w:w="1700"/>
+            <w:tcBorders>
+              <w:top w:val="single" w:color="D8D2C6" w:sz="4"/>
+              <w:left w:val="single" w:color="D8D2C6" w:sz="4"/>
+              <w:bottom w:val="single" w:color="D8D2C6" w:sz="4"/>
+              <w:right w:val="single" w:color="D8D2C6" w:sz="4"/>
+            </w:tcBorders>
+            <w:shd w:fill="F4F1EC" w:val="clear"/>
+            <w:tcMar>
+              <w:top w:type="dxa" w:w="90"/>
+              <w:left w:type="dxa" w:w="130"/>
+              <w:bottom w:type="dxa" w:w="90"/>
+              <w:right w:type="dxa" w:w="130"/>
+            </w:tcMar>
+          </w:tcPr>
+          <w:p>
+            <w:pPr>
+              <w:spacing w:after="0" w:before="0"/>
+            </w:pPr>
+            <w:r>
+              <w:rPr>
+                <w:rFonts w:ascii="Noto Serif JP" w:cs="Noto Serif JP" w:eastAsia="Noto Serif JP" w:hAnsi="Noto Serif JP"/>
+                <w:b/>
+                <w:bCs/>
+                <w:color w:val="1A1A1A"/>
+                <w:sz w:val="20"/>
+                <w:szCs w:val="20"/>
+              </w:rPr>
+              <w:t xml:space="preserve">Phase 2.3</w:t>
+            </w:r>
+          </w:p>
+        </w:tc>
+        <w:tc>
+          <w:tcPr>
+            <w:tcW w:type="dxa" w:w="7600"/>
+            <w:tcBorders>
+              <w:top w:val="single" w:color="D8D2C6" w:sz="4"/>
+              <w:left w:val="single" w:color="D8D2C6" w:sz="4"/>
+              <w:bottom w:val="single" w:color="D8D2C6" w:sz="4"/>
+              <w:right w:val="single" w:color="D8D2C6" w:sz="4"/>
+            </w:tcBorders>
+            <w:tcMar>
+              <w:top w:type="dxa" w:w="90"/>
+              <w:left w:type="dxa" w:w="130"/>
+              <w:bottom w:type="dxa" w:w="90"/>
+              <w:right w:type="dxa" w:w="130"/>
+            </w:tcMar>
+          </w:tcPr>
+          <w:p>
+            <w:pPr>
+              <w:spacing w:after="0" w:before="0"/>
+            </w:pPr>
+            <w:r>
+              <w:rPr>
+                <w:rFonts w:ascii="Noto Serif JP" w:cs="Noto Serif JP" w:eastAsia="Noto Serif JP" w:hAnsi="Noto Serif JP"/>
+                <w:b w:val="false"/>
+                <w:bCs w:val="false"/>
+                <w:color w:val="1A1A1A"/>
+                <w:sz w:val="20"/>
+                <w:szCs w:val="20"/>
+              </w:rPr>
+              <w:t xml:space="preserve">Sotto Spaces 利用契約、店舗向けライセンス保証文書</w:t>
+            </w:r>
+          </w:p>
+        </w:tc>
+      </w:tr>
+      <w:tr>
+        <w:tc>
+          <w:tcPr>
+            <w:tcW w:type="dxa" w:w="1700"/>
+            <w:tcBorders>
+              <w:top w:val="single" w:color="D8D2C6" w:sz="4"/>
+              <w:left w:val="single" w:color="D8D2C6" w:sz="4"/>
+              <w:bottom w:val="single" w:color="D8D2C6" w:sz="4"/>
+              <w:right w:val="single" w:color="D8D2C6" w:sz="4"/>
+            </w:tcBorders>
+            <w:shd w:fill="F4F1EC" w:val="clear"/>
+            <w:tcMar>
+              <w:top w:type="dxa" w:w="90"/>
+              <w:left w:type="dxa" w:w="130"/>
+              <w:bottom w:type="dxa" w:w="90"/>
+              <w:right w:type="dxa" w:w="130"/>
+            </w:tcMar>
+          </w:tcPr>
+          <w:p>
+            <w:pPr>
+              <w:spacing w:after="0" w:before="0"/>
+            </w:pPr>
+            <w:r>
+              <w:rPr>
+                <w:rFonts w:ascii="Noto Serif JP" w:cs="Noto Serif JP" w:eastAsia="Noto Serif JP" w:hAnsi="Noto Serif JP"/>
+                <w:b/>
+                <w:bCs/>
+                <w:color w:val="1A1A1A"/>
+                <w:sz w:val="20"/>
+                <w:szCs w:val="20"/>
+              </w:rPr>
+              <w:t xml:space="preserve">Phase 2.5</w:t>
+            </w:r>
+          </w:p>
+        </w:tc>
+        <w:tc>
+          <w:tcPr>
+            <w:tcW w:type="dxa" w:w="7600"/>
+            <w:tcBorders>
+              <w:top w:val="single" w:color="D8D2C6" w:sz="4"/>
+              <w:left w:val="single" w:color="D8D2C6" w:sz="4"/>
+              <w:bottom w:val="single" w:color="D8D2C6" w:sz="4"/>
+              <w:right w:val="single" w:color="D8D2C6" w:sz="4"/>
+            </w:tcBorders>
+            <w:tcMar>
+              <w:top w:type="dxa" w:w="90"/>
+              <w:left w:type="dxa" w:w="130"/>
+              <w:bottom w:type="dxa" w:w="90"/>
+              <w:right w:type="dxa" w:w="130"/>
+            </w:tcMar>
+          </w:tcPr>
+          <w:p>
+            <w:pPr>
+              <w:spacing w:after="0" w:before="0"/>
+            </w:pPr>
+            <w:r>
+              <w:rPr>
+                <w:rFonts w:ascii="Noto Serif JP" w:cs="Noto Serif JP" w:eastAsia="Noto Serif JP" w:hAnsi="Noto Serif JP"/>
+                <w:b w:val="false"/>
+                <w:bCs w:val="false"/>
+                <w:color w:val="1A1A1A"/>
+                <w:sz w:val="20"/>
+                <w:szCs w:val="20"/>
+              </w:rPr>
+              <w:t xml:space="preserve">ロイヤリティ契約、Stripe Connect 経由の自動分配契約</w:t>
+            </w:r>
+          </w:p>
+        </w:tc>
+      </w:tr>
+    </w:tbl>
+    <w:p>
+      <w:r>
+        <w:br w:type="page"/>
+      </w:r>
+    </w:p>
+    <w:p>
+      <w:pPr>
+        <w:pStyle w:val="Heading1"/>
+        <w:spacing w:after="200" w:before="360"/>
+      </w:pPr>
+      <w:r>
+        <w:rPr>
+          <w:rFonts w:ascii="Noto Serif JP" w:cs="Noto Serif JP" w:eastAsia="Noto Serif JP" w:hAnsi="Noto Serif JP"/>
+          <w:b/>
+          <w:bCs/>
+          <w:color w:val="1A1A1A"/>
+          <w:sz w:val="32"/>
+          <w:szCs w:val="32"/>
+        </w:rPr>
+        <w:t xml:space="preserve">11. 多言語化（i18n）</w:t>
+      </w:r>
+    </w:p>
+    <w:p>
+      <w:pPr>
+        <w:pBdr>
+          <w:left w:val="single" w:color="B8945C" w:sz="12" w:space="12"/>
+        </w:pBdr>
+        <w:spacing w:after="120" w:before="120"/>
+        <w:ind w:left="480" w:right="480"/>
+      </w:pPr>
+      <w:r>
+        <w:rPr>
+          <w:rFonts w:ascii="Noto Serif JP" w:cs="Noto Serif JP" w:eastAsia="Noto Serif JP" w:hAnsi="Noto Serif JP"/>
+          <w:i/>
+          <w:iCs/>
+          <w:color w:val="6E6859"/>
+          <w:sz w:val="22"/>
+          <w:szCs w:val="22"/>
+        </w:rPr>
+        <w:t xml:space="preserve">Sotto. は日本発のブランドだが、AI 音楽は国境を持たない。</w:t>
+      </w:r>
+    </w:p>
+    <w:p>
+      <w:pPr>
+        <w:pStyle w:val="Heading2"/>
+        <w:spacing w:after="140" w:before="280"/>
+      </w:pPr>
+      <w:r>
+        <w:rPr>
+          <w:rFonts w:ascii="Noto Serif JP" w:cs="Noto Serif JP" w:eastAsia="Noto Serif JP" w:hAnsi="Noto Serif JP"/>
+          <w:b/>
+          <w:bCs/>
+          <w:color w:val="1A1A1A"/>
+          <w:sz w:val="26"/>
+          <w:szCs w:val="26"/>
+        </w:rPr>
+        <w:t xml:space="preserve">11.1 方針</w:t>
+      </w:r>
+    </w:p>
+    <w:p>
+      <w:pPr>
+        <w:spacing w:after="60" w:before="60"/>
+      </w:pPr>
+      <w:r>
+        <w:rPr>
+          <w:rFonts w:ascii="Noto Serif JP" w:cs="Noto Serif JP" w:eastAsia="Noto Serif JP" w:hAnsi="Noto Serif JP"/>
+          <w:b w:val="false"/>
+          <w:bCs w:val="false"/>
+          <w:i w:val="false"/>
+          <w:iCs w:val="false"/>
+          <w:color w:val="1A1A1A"/>
+          <w:sz w:val="22"/>
+          <w:szCs w:val="22"/>
+        </w:rPr>
+        <w:t xml:space="preserve">Phase 1.6 で日本語・英語の言語切替機能を実装する。理由：</w:t>
+      </w:r>
+    </w:p>
+    <w:p>
+      <w:pPr>
+        <w:pStyle w:val="ListParagraph"/>
+        <w:numPr>
+          <w:ilvl w:val="0"/>
+          <w:numId w:val="2"/>
+        </w:numPr>
+        <w:spacing w:after="30" w:before="30"/>
+      </w:pPr>
+      <w:r>
+        <w:rPr>
+          <w:rFonts w:ascii="Noto Serif JP" w:cs="Noto Serif JP" w:eastAsia="Noto Serif JP" w:hAnsi="Noto Serif JP"/>
+          <w:color w:val="1A1A1A"/>
+          <w:sz w:val="22"/>
+          <w:szCs w:val="22"/>
+        </w:rPr>
+        <w:t xml:space="preserve">AI 音楽クリエイターはグローバルに分散している（特に Suno / Udio ユーザー）</w:t>
+      </w:r>
+    </w:p>
+    <w:p>
+      <w:pPr>
+        <w:pStyle w:val="ListParagraph"/>
+        <w:numPr>
+          <w:ilvl w:val="0"/>
+          <w:numId w:val="2"/>
+        </w:numPr>
+        <w:spacing w:after="30" w:before="30"/>
+      </w:pPr>
+      <w:r>
+        <w:rPr>
+          <w:rFonts w:ascii="Noto Serif JP" w:cs="Noto Serif JP" w:eastAsia="Noto Serif JP" w:hAnsi="Noto Serif JP"/>
+          <w:color w:val="1A1A1A"/>
+          <w:sz w:val="22"/>
+          <w:szCs w:val="22"/>
+        </w:rPr>
+        <w:t xml:space="preserve">Sotto. の世界観（ダーク・ギャラリー / The Sotto Lounge Project）は英語圏でも通用する</w:t>
+      </w:r>
+    </w:p>
+    <w:p>
+      <w:pPr>
+        <w:pStyle w:val="ListParagraph"/>
+        <w:numPr>
+          <w:ilvl w:val="0"/>
+          <w:numId w:val="2"/>
+        </w:numPr>
+        <w:spacing w:after="30" w:before="30"/>
+      </w:pPr>
+      <w:r>
+        <w:rPr>
+          <w:rFonts w:ascii="Noto Serif JP" w:cs="Noto Serif JP" w:eastAsia="Noto Serif JP" w:hAnsi="Noto Serif JP"/>
+          <w:color w:val="1A1A1A"/>
+          <w:sz w:val="22"/>
+          <w:szCs w:val="22"/>
+        </w:rPr>
+        <w:t xml:space="preserve">店舗側も、訪日インバウンド向け施設（ホテル・カフェ）は英語版があると安心</w:t>
+      </w:r>
+    </w:p>
+    <w:p>
+      <w:pPr>
+        <w:pStyle w:val="Heading2"/>
+        <w:spacing w:after="140" w:before="280"/>
+      </w:pPr>
+      <w:r>
+        <w:rPr>
+          <w:rFonts w:ascii="Noto Serif JP" w:cs="Noto Serif JP" w:eastAsia="Noto Serif JP" w:hAnsi="Noto Serif JP"/>
+          <w:b/>
+          <w:bCs/>
+          <w:color w:val="1A1A1A"/>
+          <w:sz w:val="26"/>
+          <w:szCs w:val="26"/>
+        </w:rPr>
+        <w:t xml:space="preserve">11.2 技術選択</w:t>
+      </w:r>
+    </w:p>
+    <w:tbl>
+      <w:tblPr>
+        <w:tblW w:type="dxa" w:w="9300"/>
+        <w:tblBorders>
+          <w:top w:val="single" w:color="auto" w:sz="4"/>
+          <w:left w:val="single" w:color="auto" w:sz="4"/>
+          <w:bottom w:val="single" w:color="auto" w:sz="4"/>
+          <w:right w:val="single" w:color="auto" w:sz="4"/>
+          <w:insideH w:val="single" w:color="auto" w:sz="4"/>
+          <w:insideV w:val="single" w:color="auto" w:sz="4"/>
+        </w:tblBorders>
+      </w:tblPr>
+      <w:tblGrid>
+        <w:gridCol w:w="2400"/>
+        <w:gridCol w:w="6900"/>
+      </w:tblGrid>
+      <w:tr>
+        <w:tc>
+          <w:tcPr>
+            <w:tcW w:type="dxa" w:w="2400"/>
+            <w:tcBorders>
+              <w:top w:val="single" w:color="D8D2C6" w:sz="4"/>
+              <w:left w:val="single" w:color="D8D2C6" w:sz="4"/>
+              <w:bottom w:val="single" w:color="D8D2C6" w:sz="4"/>
+              <w:right w:val="single" w:color="D8D2C6" w:sz="4"/>
+            </w:tcBorders>
+            <w:shd w:fill="F4F1EC" w:val="clear"/>
+            <w:tcMar>
+              <w:top w:type="dxa" w:w="90"/>
+              <w:left w:type="dxa" w:w="130"/>
+              <w:bottom w:type="dxa" w:w="90"/>
+              <w:right w:type="dxa" w:w="130"/>
+            </w:tcMar>
+          </w:tcPr>
+          <w:p>
+            <w:pPr>
+              <w:spacing w:after="0" w:before="0"/>
+            </w:pPr>
+            <w:r>
+              <w:rPr>
+                <w:rFonts w:ascii="Noto Serif JP" w:cs="Noto Serif JP" w:eastAsia="Noto Serif JP" w:hAnsi="Noto Serif JP"/>
+                <w:b/>
+                <w:bCs/>
+                <w:color w:val="1A1A1A"/>
+                <w:sz w:val="20"/>
+                <w:szCs w:val="20"/>
+              </w:rPr>
+              <w:t xml:space="preserve">ライブラリ</w:t>
+            </w:r>
+          </w:p>
+        </w:tc>
+        <w:tc>
+          <w:tcPr>
+            <w:tcW w:type="dxa" w:w="6900"/>
+            <w:tcBorders>
+              <w:top w:val="single" w:color="D8D2C6" w:sz="4"/>
+              <w:left w:val="single" w:color="D8D2C6" w:sz="4"/>
+              <w:bottom w:val="single" w:color="D8D2C6" w:sz="4"/>
+              <w:right w:val="single" w:color="D8D2C6" w:sz="4"/>
+            </w:tcBorders>
+            <w:tcMar>
+              <w:top w:type="dxa" w:w="90"/>
+              <w:left w:type="dxa" w:w="130"/>
+              <w:bottom w:type="dxa" w:w="90"/>
+              <w:right w:type="dxa" w:w="130"/>
+            </w:tcMar>
+          </w:tcPr>
+          <w:p>
+            <w:pPr>
+              <w:spacing w:after="0" w:before="0"/>
+            </w:pPr>
+            <w:r>
+              <w:rPr>
+                <w:rFonts w:ascii="Noto Serif JP" w:cs="Noto Serif JP" w:eastAsia="Noto Serif JP" w:hAnsi="Noto Serif JP"/>
+                <w:b w:val="false"/>
+                <w:bCs w:val="false"/>
+                <w:color w:val="1A1A1A"/>
+                <w:sz w:val="20"/>
+                <w:szCs w:val="20"/>
+              </w:rPr>
+              <w:t xml:space="preserve">next-intl（Next.js 公式推奨、App Router 対応）</w:t>
+            </w:r>
+          </w:p>
+        </w:tc>
+      </w:tr>
+      <w:tr>
+        <w:tc>
+          <w:tcPr>
+            <w:tcW w:type="dxa" w:w="2400"/>
+            <w:tcBorders>
+              <w:top w:val="single" w:color="D8D2C6" w:sz="4"/>
+              <w:left w:val="single" w:color="D8D2C6" w:sz="4"/>
+              <w:bottom w:val="single" w:color="D8D2C6" w:sz="4"/>
+              <w:right w:val="single" w:color="D8D2C6" w:sz="4"/>
+            </w:tcBorders>
+            <w:shd w:fill="F4F1EC" w:val="clear"/>
+            <w:tcMar>
+              <w:top w:type="dxa" w:w="90"/>
+              <w:left w:type="dxa" w:w="130"/>
+              <w:bottom w:type="dxa" w:w="90"/>
+              <w:right w:type="dxa" w:w="130"/>
+            </w:tcMar>
+          </w:tcPr>
+          <w:p>
+            <w:pPr>
+              <w:spacing w:after="0" w:before="0"/>
+            </w:pPr>
+            <w:r>
+              <w:rPr>
+                <w:rFonts w:ascii="Noto Serif JP" w:cs="Noto Serif JP" w:eastAsia="Noto Serif JP" w:hAnsi="Noto Serif JP"/>
+                <w:b/>
+                <w:bCs/>
+                <w:color w:val="1A1A1A"/>
+                <w:sz w:val="20"/>
+                <w:szCs w:val="20"/>
+              </w:rPr>
+              <w:t xml:space="preserve">URL 構造</w:t>
+            </w:r>
+          </w:p>
+        </w:tc>
+        <w:tc>
+          <w:tcPr>
+            <w:tcW w:type="dxa" w:w="6900"/>
+            <w:tcBorders>
+              <w:top w:val="single" w:color="D8D2C6" w:sz="4"/>
+              <w:left w:val="single" w:color="D8D2C6" w:sz="4"/>
+              <w:bottom w:val="single" w:color="D8D2C6" w:sz="4"/>
+              <w:right w:val="single" w:color="D8D2C6" w:sz="4"/>
+            </w:tcBorders>
+            <w:tcMar>
+              <w:top w:type="dxa" w:w="90"/>
+              <w:left w:type="dxa" w:w="130"/>
+              <w:bottom w:type="dxa" w:w="90"/>
+              <w:right w:type="dxa" w:w="130"/>
+            </w:tcMar>
+          </w:tcPr>
+          <w:p>
+            <w:pPr>
+              <w:spacing w:after="0" w:before="0"/>
+            </w:pPr>
+            <w:r>
+              <w:rPr>
+                <w:rFonts w:ascii="Noto Serif JP" w:cs="Noto Serif JP" w:eastAsia="Noto Serif JP" w:hAnsi="Noto Serif JP"/>
+                <w:b w:val="false"/>
+                <w:bCs w:val="false"/>
+                <w:color w:val="1A1A1A"/>
+                <w:sz w:val="20"/>
+                <w:szCs w:val="20"/>
+              </w:rPr>
+              <w:t xml:space="preserve">/ja/, /en/ をパスに含む（SEO に有利）</w:t>
+            </w:r>
+          </w:p>
+        </w:tc>
+      </w:tr>
+      <w:tr>
+        <w:tc>
+          <w:tcPr>
+            <w:tcW w:type="dxa" w:w="2400"/>
+            <w:tcBorders>
+              <w:top w:val="single" w:color="D8D2C6" w:sz="4"/>
+              <w:left w:val="single" w:color="D8D2C6" w:sz="4"/>
+              <w:bottom w:val="single" w:color="D8D2C6" w:sz="4"/>
+              <w:right w:val="single" w:color="D8D2C6" w:sz="4"/>
+            </w:tcBorders>
+            <w:shd w:fill="F4F1EC" w:val="clear"/>
+            <w:tcMar>
+              <w:top w:type="dxa" w:w="90"/>
+              <w:left w:type="dxa" w:w="130"/>
+              <w:bottom w:type="dxa" w:w="90"/>
+              <w:right w:type="dxa" w:w="130"/>
+            </w:tcMar>
+          </w:tcPr>
+          <w:p>
+            <w:pPr>
+              <w:spacing w:after="0" w:before="0"/>
+            </w:pPr>
+            <w:r>
+              <w:rPr>
+                <w:rFonts w:ascii="Noto Serif JP" w:cs="Noto Serif JP" w:eastAsia="Noto Serif JP" w:hAnsi="Noto Serif JP"/>
+                <w:b/>
+                <w:bCs/>
+                <w:color w:val="1A1A1A"/>
+                <w:sz w:val="20"/>
+                <w:szCs w:val="20"/>
+              </w:rPr>
+              <w:t xml:space="preserve">既定言語</w:t>
+            </w:r>
+          </w:p>
+        </w:tc>
+        <w:tc>
+          <w:tcPr>
+            <w:tcW w:type="dxa" w:w="6900"/>
+            <w:tcBorders>
+              <w:top w:val="single" w:color="D8D2C6" w:sz="4"/>
+              <w:left w:val="single" w:color="D8D2C6" w:sz="4"/>
+              <w:bottom w:val="single" w:color="D8D2C6" w:sz="4"/>
+              <w:right w:val="single" w:color="D8D2C6" w:sz="4"/>
+            </w:tcBorders>
+            <w:tcMar>
+              <w:top w:type="dxa" w:w="90"/>
+              <w:left w:type="dxa" w:w="130"/>
+              <w:bottom w:type="dxa" w:w="90"/>
+              <w:right w:type="dxa" w:w="130"/>
+            </w:tcMar>
+          </w:tcPr>
+          <w:p>
+            <w:pPr>
+              <w:spacing w:after="0" w:before="0"/>
+            </w:pPr>
+            <w:r>
+              <w:rPr>
+                <w:rFonts w:ascii="Noto Serif JP" w:cs="Noto Serif JP" w:eastAsia="Noto Serif JP" w:hAnsi="Noto Serif JP"/>
+                <w:b w:val="false"/>
+                <w:bCs w:val="false"/>
+                <w:color w:val="1A1A1A"/>
+                <w:sz w:val="20"/>
+                <w:szCs w:val="20"/>
+              </w:rPr>
+              <w:t xml:space="preserve">日本語（ブラウザ言語と Accept-Language で自動振り分け）</w:t>
+            </w:r>
+          </w:p>
+        </w:tc>
+      </w:tr>
+      <w:tr>
+        <w:tc>
+          <w:tcPr>
+            <w:tcW w:type="dxa" w:w="2400"/>
+            <w:tcBorders>
+              <w:top w:val="single" w:color="D8D2C6" w:sz="4"/>
+              <w:left w:val="single" w:color="D8D2C6" w:sz="4"/>
+              <w:bottom w:val="single" w:color="D8D2C6" w:sz="4"/>
+              <w:right w:val="single" w:color="D8D2C6" w:sz="4"/>
+            </w:tcBorders>
+            <w:shd w:fill="F4F1EC" w:val="clear"/>
+            <w:tcMar>
+              <w:top w:type="dxa" w:w="90"/>
+              <w:left w:type="dxa" w:w="130"/>
+              <w:bottom w:type="dxa" w:w="90"/>
+              <w:right w:type="dxa" w:w="130"/>
+            </w:tcMar>
+          </w:tcPr>
+          <w:p>
+            <w:pPr>
+              <w:spacing w:after="0" w:before="0"/>
+            </w:pPr>
+            <w:r>
+              <w:rPr>
+                <w:rFonts w:ascii="Noto Serif JP" w:cs="Noto Serif JP" w:eastAsia="Noto Serif JP" w:hAnsi="Noto Serif JP"/>
+                <w:b/>
+                <w:bCs/>
+                <w:color w:val="1A1A1A"/>
+                <w:sz w:val="20"/>
+                <w:szCs w:val="20"/>
+              </w:rPr>
+              <w:t xml:space="preserve">切替UI</w:t>
+            </w:r>
+          </w:p>
+        </w:tc>
+        <w:tc>
+          <w:tcPr>
+            <w:tcW w:type="dxa" w:w="6900"/>
+            <w:tcBorders>
+              <w:top w:val="single" w:color="D8D2C6" w:sz="4"/>
+              <w:left w:val="single" w:color="D8D2C6" w:sz="4"/>
+              <w:bottom w:val="single" w:color="D8D2C6" w:sz="4"/>
+              <w:right w:val="single" w:color="D8D2C6" w:sz="4"/>
+            </w:tcBorders>
+            <w:tcMar>
+              <w:top w:type="dxa" w:w="90"/>
+              <w:left w:type="dxa" w:w="130"/>
+              <w:bottom w:type="dxa" w:w="90"/>
+              <w:right w:type="dxa" w:w="130"/>
+            </w:tcMar>
+          </w:tcPr>
+          <w:p>
+            <w:pPr>
+              <w:spacing w:after="0" w:before="0"/>
+            </w:pPr>
+            <w:r>
+              <w:rPr>
+                <w:rFonts w:ascii="Noto Serif JP" w:cs="Noto Serif JP" w:eastAsia="Noto Serif JP" w:hAnsi="Noto Serif JP"/>
+                <w:b w:val="false"/>
+                <w:bCs w:val="false"/>
+                <w:color w:val="1A1A1A"/>
+                <w:sz w:val="20"/>
+                <w:szCs w:val="20"/>
+              </w:rPr>
+              <w:t xml:space="preserve">ヘッダー右上に「JA ⌇ EN」セグメント</w:t>
+            </w:r>
+          </w:p>
+        </w:tc>
+      </w:tr>
+      <w:tr>
+        <w:tc>
+          <w:tcPr>
+            <w:tcW w:type="dxa" w:w="2400"/>
+            <w:tcBorders>
+              <w:top w:val="single" w:color="D8D2C6" w:sz="4"/>
+              <w:left w:val="single" w:color="D8D2C6" w:sz="4"/>
+              <w:bottom w:val="single" w:color="D8D2C6" w:sz="4"/>
+              <w:right w:val="single" w:color="D8D2C6" w:sz="4"/>
+            </w:tcBorders>
+            <w:shd w:fill="F4F1EC" w:val="clear"/>
+            <w:tcMar>
+              <w:top w:type="dxa" w:w="90"/>
+              <w:left w:type="dxa" w:w="130"/>
+              <w:bottom w:type="dxa" w:w="90"/>
+              <w:right w:type="dxa" w:w="130"/>
+            </w:tcMar>
+          </w:tcPr>
+          <w:p>
+            <w:pPr>
+              <w:spacing w:after="0" w:before="0"/>
+            </w:pPr>
+            <w:r>
+              <w:rPr>
+                <w:rFonts w:ascii="Noto Serif JP" w:cs="Noto Serif JP" w:eastAsia="Noto Serif JP" w:hAnsi="Noto Serif JP"/>
+                <w:b/>
+                <w:bCs/>
+                <w:color w:val="1A1A1A"/>
+                <w:sz w:val="20"/>
+                <w:szCs w:val="20"/>
+              </w:rPr>
+              <w:t xml:space="preserve">メッセージ管理</w:t>
+            </w:r>
+          </w:p>
+        </w:tc>
+        <w:tc>
+          <w:tcPr>
+            <w:tcW w:type="dxa" w:w="6900"/>
+            <w:tcBorders>
+              <w:top w:val="single" w:color="D8D2C6" w:sz="4"/>
+              <w:left w:val="single" w:color="D8D2C6" w:sz="4"/>
+              <w:bottom w:val="single" w:color="D8D2C6" w:sz="4"/>
+              <w:right w:val="single" w:color="D8D2C6" w:sz="4"/>
+            </w:tcBorders>
+            <w:tcMar>
+              <w:top w:type="dxa" w:w="90"/>
+              <w:left w:type="dxa" w:w="130"/>
+              <w:bottom w:type="dxa" w:w="90"/>
+              <w:right w:type="dxa" w:w="130"/>
+            </w:tcMar>
+          </w:tcPr>
+          <w:p>
+            <w:pPr>
+              <w:spacing w:after="0" w:before="0"/>
+            </w:pPr>
+            <w:r>
+              <w:rPr>
+                <w:rFonts w:ascii="Noto Serif JP" w:cs="Noto Serif JP" w:eastAsia="Noto Serif JP" w:hAnsi="Noto Serif JP"/>
+                <w:b w:val="false"/>
+                <w:bCs w:val="false"/>
+                <w:color w:val="1A1A1A"/>
+                <w:sz w:val="20"/>
+                <w:szCs w:val="20"/>
+              </w:rPr>
+              <w:t xml:space="preserve">messages/ja.json / messages/en.json</w:t>
+            </w:r>
+          </w:p>
+        </w:tc>
+      </w:tr>
+    </w:tbl>
+    <w:p>
+      <w:pPr>
+        <w:pStyle w:val="Heading2"/>
+        <w:spacing w:after="140" w:before="280"/>
+      </w:pPr>
+      <w:r>
+        <w:rPr>
+          <w:rFonts w:ascii="Noto Serif JP" w:cs="Noto Serif JP" w:eastAsia="Noto Serif JP" w:hAnsi="Noto Serif JP"/>
+          <w:b/>
+          <w:bCs/>
+          <w:color w:val="1A1A1A"/>
+          <w:sz w:val="26"/>
+          <w:szCs w:val="26"/>
+        </w:rPr>
+        <w:t xml:space="preserve">11.3 翻訳対象の優先順位</w:t>
+      </w:r>
+    </w:p>
+    <w:p>
+      <w:pPr>
+        <w:pStyle w:val="ListParagraph"/>
+        <w:numPr>
+          <w:ilvl w:val="0"/>
+          <w:numId w:val="3"/>
+        </w:numPr>
+        <w:spacing w:after="30" w:before="30"/>
+      </w:pPr>
+      <w:r>
+        <w:rPr>
+          <w:rFonts w:ascii="Noto Serif JP" w:cs="Noto Serif JP" w:eastAsia="Noto Serif JP" w:hAnsi="Noto Serif JP"/>
+          <w:color w:val="1A1A1A"/>
+          <w:sz w:val="22"/>
+          <w:szCs w:val="22"/>
+        </w:rPr>
+        <w:t xml:space="preserve">ナビゲーション / ボタン（最優先）</w:t>
+      </w:r>
+    </w:p>
+    <w:p>
+      <w:pPr>
+        <w:pStyle w:val="ListParagraph"/>
+        <w:numPr>
+          <w:ilvl w:val="0"/>
+          <w:numId w:val="3"/>
+        </w:numPr>
+        <w:spacing w:after="30" w:before="30"/>
+      </w:pPr>
+      <w:r>
+        <w:rPr>
+          <w:rFonts w:ascii="Noto Serif JP" w:cs="Noto Serif JP" w:eastAsia="Noto Serif JP" w:hAnsi="Noto Serif JP"/>
+          <w:color w:val="1A1A1A"/>
+          <w:sz w:val="22"/>
+          <w:szCs w:val="22"/>
+        </w:rPr>
+        <w:t xml:space="preserve">投稿フォームのフィールド名・ヒント</w:t>
+      </w:r>
+    </w:p>
+    <w:p>
+      <w:pPr>
+        <w:pStyle w:val="ListParagraph"/>
+        <w:numPr>
+          <w:ilvl w:val="0"/>
+          <w:numId w:val="3"/>
+        </w:numPr>
+        <w:spacing w:after="30" w:before="30"/>
+      </w:pPr>
+      <w:r>
+        <w:rPr>
+          <w:rFonts w:ascii="Noto Serif JP" w:cs="Noto Serif JP" w:eastAsia="Noto Serif JP" w:hAnsi="Noto Serif JP"/>
+          <w:color w:val="1A1A1A"/>
+          <w:sz w:val="22"/>
+          <w:szCs w:val="22"/>
+        </w:rPr>
+        <w:t xml:space="preserve">エラーメッセージ</w:t>
+      </w:r>
+    </w:p>
+    <w:p>
+      <w:pPr>
+        <w:pStyle w:val="ListParagraph"/>
+        <w:numPr>
+          <w:ilvl w:val="0"/>
+          <w:numId w:val="3"/>
+        </w:numPr>
+        <w:spacing w:after="30" w:before="30"/>
+      </w:pPr>
+      <w:r>
+        <w:rPr>
+          <w:rFonts w:ascii="Noto Serif JP" w:cs="Noto Serif JP" w:eastAsia="Noto Serif JP" w:hAnsi="Noto Serif JP"/>
+          <w:color w:val="1A1A1A"/>
+          <w:sz w:val="22"/>
+          <w:szCs w:val="22"/>
+        </w:rPr>
+        <w:t xml:space="preserve">ランディングコピー（タグライン・コンセプト）</w:t>
+      </w:r>
+    </w:p>
+    <w:p>
+      <w:pPr>
+        <w:pStyle w:val="ListParagraph"/>
+        <w:numPr>
+          <w:ilvl w:val="0"/>
+          <w:numId w:val="3"/>
+        </w:numPr>
+        <w:spacing w:after="30" w:before="30"/>
+      </w:pPr>
+      <w:r>
+        <w:rPr>
+          <w:rFonts w:ascii="Noto Serif JP" w:cs="Noto Serif JP" w:eastAsia="Noto Serif JP" w:hAnsi="Noto Serif JP"/>
+          <w:color w:val="1A1A1A"/>
+          <w:sz w:val="22"/>
+          <w:szCs w:val="22"/>
+        </w:rPr>
+        <w:t xml:space="preserve">Letter ページ（やこさんの想いの英訳）</w:t>
+      </w:r>
+    </w:p>
+    <w:p>
+      <w:pPr>
+        <w:pStyle w:val="ListParagraph"/>
+        <w:numPr>
+          <w:ilvl w:val="0"/>
+          <w:numId w:val="3"/>
+        </w:numPr>
+        <w:spacing w:after="30" w:before="30"/>
+      </w:pPr>
+      <w:r>
+        <w:rPr>
+          <w:rFonts w:ascii="Noto Serif JP" w:cs="Noto Serif JP" w:eastAsia="Noto Serif JP" w:hAnsi="Noto Serif JP"/>
+          <w:color w:val="1A1A1A"/>
+          <w:sz w:val="22"/>
+          <w:szCs w:val="22"/>
+        </w:rPr>
+        <w:t xml:space="preserve">利用規約・プライバシーポリシー（要弁護士チェック）</w:t>
+      </w:r>
+    </w:p>
+    <w:p>
+      <w:pPr>
+        <w:pStyle w:val="Heading2"/>
+        <w:spacing w:after="140" w:before="280"/>
+      </w:pPr>
+      <w:r>
+        <w:rPr>
+          <w:rFonts w:ascii="Noto Serif JP" w:cs="Noto Serif JP" w:eastAsia="Noto Serif JP" w:hAnsi="Noto Serif JP"/>
+          <w:b/>
+          <w:bCs/>
+          <w:color w:val="1A1A1A"/>
+          <w:sz w:val="26"/>
+          <w:szCs w:val="26"/>
+        </w:rPr>
+        <w:t xml:space="preserve">11.4 ブランド世界観の翻訳ポリシー</w:t>
+      </w:r>
+    </w:p>
+    <w:p>
+      <w:pPr>
+        <w:spacing w:after="60" w:before="60"/>
+      </w:pPr>
+      <w:r>
+        <w:rPr>
+          <w:rFonts w:ascii="Noto Serif JP" w:cs="Noto Serif JP" w:eastAsia="Noto Serif JP" w:hAnsi="Noto Serif JP"/>
+          <w:b w:val="false"/>
+          <w:bCs w:val="false"/>
+          <w:i w:val="false"/>
+          <w:iCs w:val="false"/>
+          <w:color w:val="1A1A1A"/>
+          <w:sz w:val="22"/>
+          <w:szCs w:val="22"/>
+        </w:rPr>
+        <w:t xml:space="preserve">単純な翻訳ではなく、Sotto. の余白と静けさを英語でも保つ。</w:t>
+      </w:r>
+    </w:p>
+    <w:p>
+      <w:pPr>
+        <w:spacing w:after="60" w:before="60"/>
+      </w:pPr>
+      <w:r>
+        <w:rPr>
+          <w:rFonts w:ascii="Noto Serif JP" w:cs="Noto Serif JP" w:eastAsia="Noto Serif JP" w:hAnsi="Noto Serif JP"/>
+          <w:b w:val="false"/>
+          <w:bCs w:val="false"/>
+          <w:i w:val="false"/>
+          <w:iCs w:val="false"/>
+          <w:color w:val="1A1A1A"/>
+          <w:sz w:val="22"/>
+          <w:szCs w:val="22"/>
+        </w:rPr>
+        <w:t xml:space="preserve"/>
+      </w:r>
+    </w:p>
+    <w:tbl>
+      <w:tblPr>
+        <w:tblW w:type="dxa" w:w="9300"/>
+        <w:tblBorders>
+          <w:top w:val="single" w:color="auto" w:sz="4"/>
+          <w:left w:val="single" w:color="auto" w:sz="4"/>
+          <w:bottom w:val="single" w:color="auto" w:sz="4"/>
+          <w:right w:val="single" w:color="auto" w:sz="4"/>
+          <w:insideH w:val="single" w:color="auto" w:sz="4"/>
+          <w:insideV w:val="single" w:color="auto" w:sz="4"/>
+        </w:tblBorders>
+      </w:tblPr>
+      <w:tblGrid>
+        <w:gridCol w:w="3000"/>
+        <w:gridCol w:w="6300"/>
+      </w:tblGrid>
+      <w:tr>
+        <w:tc>
+          <w:tcPr>
+            <w:tcW w:type="dxa" w:w="3000"/>
+            <w:tcBorders>
+              <w:top w:val="single" w:color="D8D2C6" w:sz="4"/>
+              <w:left w:val="single" w:color="D8D2C6" w:sz="4"/>
+              <w:bottom w:val="single" w:color="D8D2C6" w:sz="4"/>
+              <w:right w:val="single" w:color="D8D2C6" w:sz="4"/>
+            </w:tcBorders>
+            <w:shd w:fill="FAF5EB" w:val="clear"/>
+            <w:tcMar>
+              <w:top w:type="dxa" w:w="90"/>
+              <w:left w:type="dxa" w:w="130"/>
+              <w:bottom w:type="dxa" w:w="90"/>
+              <w:right w:type="dxa" w:w="130"/>
+            </w:tcMar>
+          </w:tcPr>
+          <w:p>
+            <w:pPr>
+              <w:spacing w:after="0" w:before="0"/>
+            </w:pPr>
+            <w:r>
+              <w:rPr>
+                <w:rFonts w:ascii="Noto Serif JP" w:cs="Noto Serif JP" w:eastAsia="Noto Serif JP" w:hAnsi="Noto Serif JP"/>
+                <w:b/>
+                <w:bCs/>
+                <w:color w:val="1A1A1A"/>
+                <w:sz w:val="20"/>
+                <w:szCs w:val="20"/>
+              </w:rPr>
+              <w:t xml:space="preserve">日本語</w:t>
+            </w:r>
+          </w:p>
+        </w:tc>
+        <w:tc>
+          <w:tcPr>
+            <w:tcW w:type="dxa" w:w="6300"/>
+            <w:tcBorders>
+              <w:top w:val="single" w:color="D8D2C6" w:sz="4"/>
+              <w:left w:val="single" w:color="D8D2C6" w:sz="4"/>
+              <w:bottom w:val="single" w:color="D8D2C6" w:sz="4"/>
+              <w:right w:val="single" w:color="D8D2C6" w:sz="4"/>
+            </w:tcBorders>
+            <w:shd w:fill="FAF5EB" w:val="clear"/>
+            <w:tcMar>
+              <w:top w:type="dxa" w:w="90"/>
+              <w:left w:type="dxa" w:w="130"/>
+              <w:bottom w:type="dxa" w:w="90"/>
+              <w:right w:type="dxa" w:w="130"/>
+            </w:tcMar>
+          </w:tcPr>
+          <w:p>
+            <w:pPr>
+              <w:spacing w:after="0" w:before="0"/>
+            </w:pPr>
+            <w:r>
+              <w:rPr>
+                <w:rFonts w:ascii="Noto Serif JP" w:cs="Noto Serif JP" w:eastAsia="Noto Serif JP" w:hAnsi="Noto Serif JP"/>
+                <w:b/>
+                <w:bCs/>
+                <w:color w:val="1A1A1A"/>
+                <w:sz w:val="20"/>
+                <w:szCs w:val="20"/>
+              </w:rPr>
+              <w:t xml:space="preserve">英語</w:t>
+            </w:r>
+          </w:p>
+        </w:tc>
+      </w:tr>
+      <w:tr>
+        <w:tc>
+          <w:tcPr>
+            <w:tcW w:type="dxa" w:w="3000"/>
+            <w:tcBorders>
+              <w:top w:val="single" w:color="D8D2C6" w:sz="4"/>
+              <w:left w:val="single" w:color="D8D2C6" w:sz="4"/>
+              <w:bottom w:val="single" w:color="D8D2C6" w:sz="4"/>
+              <w:right w:val="single" w:color="D8D2C6" w:sz="4"/>
+            </w:tcBorders>
+            <w:tcMar>
+              <w:top w:type="dxa" w:w="90"/>
+              <w:left w:type="dxa" w:w="130"/>
+              <w:bottom w:type="dxa" w:w="90"/>
+              <w:right w:type="dxa" w:w="130"/>
+            </w:tcMar>
+          </w:tcPr>
+          <w:p>
+            <w:pPr>
+              <w:spacing w:after="0" w:before="0"/>
+            </w:pPr>
+            <w:r>
+              <w:rPr>
+                <w:rFonts w:ascii="Noto Serif JP" w:cs="Noto Serif JP" w:eastAsia="Noto Serif JP" w:hAnsi="Noto Serif JP"/>
+                <w:b w:val="false"/>
+                <w:bCs w:val="false"/>
+                <w:color w:val="1A1A1A"/>
+                <w:sz w:val="20"/>
+                <w:szCs w:val="20"/>
+              </w:rPr>
+              <w:t xml:space="preserve">音楽が空間に届く。</w:t>
+            </w:r>
+          </w:p>
+        </w:tc>
+        <w:tc>
+          <w:tcPr>
+            <w:tcW w:type="dxa" w:w="6300"/>
+            <w:tcBorders>
+              <w:top w:val="single" w:color="D8D2C6" w:sz="4"/>
+              <w:left w:val="single" w:color="D8D2C6" w:sz="4"/>
+              <w:bottom w:val="single" w:color="D8D2C6" w:sz="4"/>
+              <w:right w:val="single" w:color="D8D2C6" w:sz="4"/>
+            </w:tcBorders>
+            <w:tcMar>
+              <w:top w:type="dxa" w:w="90"/>
+              <w:left w:type="dxa" w:w="130"/>
+              <w:bottom w:type="dxa" w:w="90"/>
+              <w:right w:type="dxa" w:w="130"/>
+            </w:tcMar>
+          </w:tcPr>
+          <w:p>
+            <w:pPr>
+              <w:spacing w:after="0" w:before="0"/>
+            </w:pPr>
+            <w:r>
+              <w:rPr>
+                <w:rFonts w:ascii="Noto Serif JP" w:cs="Noto Serif JP" w:eastAsia="Noto Serif JP" w:hAnsi="Noto Serif JP"/>
+                <w:b w:val="false"/>
+                <w:bCs w:val="false"/>
+                <w:color w:val="1A1A1A"/>
+                <w:sz w:val="20"/>
+                <w:szCs w:val="20"/>
+              </w:rPr>
+              <w:t xml:space="preserve">Music delivered to spaces.</w:t>
+            </w:r>
+          </w:p>
+        </w:tc>
+      </w:tr>
+      <w:tr>
+        <w:tc>
+          <w:tcPr>
+            <w:tcW w:type="dxa" w:w="3000"/>
+            <w:tcBorders>
+              <w:top w:val="single" w:color="D8D2C6" w:sz="4"/>
+              <w:left w:val="single" w:color="D8D2C6" w:sz="4"/>
+              <w:bottom w:val="single" w:color="D8D2C6" w:sz="4"/>
+              <w:right w:val="single" w:color="D8D2C6" w:sz="4"/>
+            </w:tcBorders>
+            <w:tcMar>
+              <w:top w:type="dxa" w:w="90"/>
+              <w:left w:type="dxa" w:w="130"/>
+              <w:bottom w:type="dxa" w:w="90"/>
+              <w:right w:type="dxa" w:w="130"/>
+            </w:tcMar>
+          </w:tcPr>
+          <w:p>
+            <w:pPr>
+              <w:spacing w:after="0" w:before="0"/>
+            </w:pPr>
+            <w:r>
+              <w:rPr>
+                <w:rFonts w:ascii="Noto Serif JP" w:cs="Noto Serif JP" w:eastAsia="Noto Serif JP" w:hAnsi="Noto Serif JP"/>
+                <w:b w:val="false"/>
+                <w:bCs w:val="false"/>
+                <w:color w:val="1A1A1A"/>
+                <w:sz w:val="20"/>
+                <w:szCs w:val="20"/>
+              </w:rPr>
+              <w:t xml:space="preserve">作品を置く</w:t>
+            </w:r>
+          </w:p>
+        </w:tc>
+        <w:tc>
+          <w:tcPr>
+            <w:tcW w:type="dxa" w:w="6300"/>
+            <w:tcBorders>
+              <w:top w:val="single" w:color="D8D2C6" w:sz="4"/>
+              <w:left w:val="single" w:color="D8D2C6" w:sz="4"/>
+              <w:bottom w:val="single" w:color="D8D2C6" w:sz="4"/>
+              <w:right w:val="single" w:color="D8D2C6" w:sz="4"/>
+            </w:tcBorders>
+            <w:tcMar>
+              <w:top w:type="dxa" w:w="90"/>
+              <w:left w:type="dxa" w:w="130"/>
+              <w:bottom w:type="dxa" w:w="90"/>
+              <w:right w:type="dxa" w:w="130"/>
+            </w:tcMar>
+          </w:tcPr>
+          <w:p>
+            <w:pPr>
+              <w:spacing w:after="0" w:before="0"/>
+            </w:pPr>
+            <w:r>
+              <w:rPr>
+                <w:rFonts w:ascii="Noto Serif JP" w:cs="Noto Serif JP" w:eastAsia="Noto Serif JP" w:hAnsi="Noto Serif JP"/>
+                <w:b w:val="false"/>
+                <w:bCs w:val="false"/>
+                <w:color w:val="1A1A1A"/>
+                <w:sz w:val="20"/>
+                <w:szCs w:val="20"/>
+              </w:rPr>
+              <w:t xml:space="preserve">Place a work</w:t>
+            </w:r>
+          </w:p>
+        </w:tc>
+      </w:tr>
+      <w:tr>
+        <w:tc>
+          <w:tcPr>
+            <w:tcW w:type="dxa" w:w="3000"/>
+            <w:tcBorders>
+              <w:top w:val="single" w:color="D8D2C6" w:sz="4"/>
+              <w:left w:val="single" w:color="D8D2C6" w:sz="4"/>
+              <w:bottom w:val="single" w:color="D8D2C6" w:sz="4"/>
+              <w:right w:val="single" w:color="D8D2C6" w:sz="4"/>
+            </w:tcBorders>
+            <w:tcMar>
+              <w:top w:type="dxa" w:w="90"/>
+              <w:left w:type="dxa" w:w="130"/>
+              <w:bottom w:type="dxa" w:w="90"/>
+              <w:right w:type="dxa" w:w="130"/>
+            </w:tcMar>
+          </w:tcPr>
+          <w:p>
+            <w:pPr>
+              <w:spacing w:after="0" w:before="0"/>
+            </w:pPr>
+            <w:r>
+              <w:rPr>
+                <w:rFonts w:ascii="Noto Serif JP" w:cs="Noto Serif JP" w:eastAsia="Noto Serif JP" w:hAnsi="Noto Serif JP"/>
+                <w:b w:val="false"/>
+                <w:bCs w:val="false"/>
+                <w:color w:val="1A1A1A"/>
+                <w:sz w:val="20"/>
+                <w:szCs w:val="20"/>
+              </w:rPr>
+              <w:t xml:space="preserve">マイギャラリー</w:t>
+            </w:r>
+          </w:p>
+        </w:tc>
+        <w:tc>
+          <w:tcPr>
+            <w:tcW w:type="dxa" w:w="6300"/>
+            <w:tcBorders>
+              <w:top w:val="single" w:color="D8D2C6" w:sz="4"/>
+              <w:left w:val="single" w:color="D8D2C6" w:sz="4"/>
+              <w:bottom w:val="single" w:color="D8D2C6" w:sz="4"/>
+              <w:right w:val="single" w:color="D8D2C6" w:sz="4"/>
+            </w:tcBorders>
+            <w:tcMar>
+              <w:top w:type="dxa" w:w="90"/>
+              <w:left w:type="dxa" w:w="130"/>
+              <w:bottom w:type="dxa" w:w="90"/>
+              <w:right w:type="dxa" w:w="130"/>
+            </w:tcMar>
+          </w:tcPr>
+          <w:p>
+            <w:pPr>
+              <w:spacing w:after="0" w:before="0"/>
+            </w:pPr>
+            <w:r>
+              <w:rPr>
+                <w:rFonts w:ascii="Noto Serif JP" w:cs="Noto Serif JP" w:eastAsia="Noto Serif JP" w:hAnsi="Noto Serif JP"/>
+                <w:b w:val="false"/>
+                <w:bCs w:val="false"/>
+                <w:color w:val="1A1A1A"/>
+                <w:sz w:val="20"/>
+                <w:szCs w:val="20"/>
+              </w:rPr>
+              <w:t xml:space="preserve">My Gallery</w:t>
+            </w:r>
+          </w:p>
+        </w:tc>
+      </w:tr>
+      <w:tr>
+        <w:tc>
+          <w:tcPr>
+            <w:tcW w:type="dxa" w:w="3000"/>
+            <w:tcBorders>
+              <w:top w:val="single" w:color="D8D2C6" w:sz="4"/>
+              <w:left w:val="single" w:color="D8D2C6" w:sz="4"/>
+              <w:bottom w:val="single" w:color="D8D2C6" w:sz="4"/>
+              <w:right w:val="single" w:color="D8D2C6" w:sz="4"/>
+            </w:tcBorders>
+            <w:tcMar>
+              <w:top w:type="dxa" w:w="90"/>
+              <w:left w:type="dxa" w:w="130"/>
+              <w:bottom w:type="dxa" w:w="90"/>
+              <w:right w:type="dxa" w:w="130"/>
+            </w:tcMar>
+          </w:tcPr>
+          <w:p>
+            <w:pPr>
+              <w:spacing w:after="0" w:before="0"/>
+            </w:pPr>
+            <w:r>
+              <w:rPr>
+                <w:rFonts w:ascii="Noto Serif JP" w:cs="Noto Serif JP" w:eastAsia="Noto Serif JP" w:hAnsi="Noto Serif JP"/>
+                <w:b w:val="false"/>
+                <w:bCs w:val="false"/>
+                <w:color w:val="1A1A1A"/>
+                <w:sz w:val="20"/>
+                <w:szCs w:val="20"/>
+              </w:rPr>
+              <w:t xml:space="preserve">1曲を、静かにここに置く。</w:t>
+            </w:r>
+          </w:p>
+        </w:tc>
+        <w:tc>
+          <w:tcPr>
+            <w:tcW w:type="dxa" w:w="6300"/>
+            <w:tcBorders>
+              <w:top w:val="single" w:color="D8D2C6" w:sz="4"/>
+              <w:left w:val="single" w:color="D8D2C6" w:sz="4"/>
+              <w:bottom w:val="single" w:color="D8D2C6" w:sz="4"/>
+              <w:right w:val="single" w:color="D8D2C6" w:sz="4"/>
+            </w:tcBorders>
+            <w:tcMar>
+              <w:top w:type="dxa" w:w="90"/>
+              <w:left w:type="dxa" w:w="130"/>
+              <w:bottom w:type="dxa" w:w="90"/>
+              <w:right w:type="dxa" w:w="130"/>
+            </w:tcMar>
+          </w:tcPr>
+          <w:p>
+            <w:pPr>
+              <w:spacing w:after="0" w:before="0"/>
+            </w:pPr>
+            <w:r>
+              <w:rPr>
+                <w:rFonts w:ascii="Noto Serif JP" w:cs="Noto Serif JP" w:eastAsia="Noto Serif JP" w:hAnsi="Noto Serif JP"/>
+                <w:b w:val="false"/>
+                <w:bCs w:val="false"/>
+                <w:color w:val="1A1A1A"/>
+                <w:sz w:val="20"/>
+                <w:szCs w:val="20"/>
+              </w:rPr>
+              <w:t xml:space="preserve">Place a work, quietly.</w:t>
+            </w:r>
+          </w:p>
+        </w:tc>
+      </w:tr>
+      <w:tr>
+        <w:tc>
+          <w:tcPr>
+            <w:tcW w:type="dxa" w:w="3000"/>
+            <w:tcBorders>
+              <w:top w:val="single" w:color="D8D2C6" w:sz="4"/>
+              <w:left w:val="single" w:color="D8D2C6" w:sz="4"/>
+              <w:bottom w:val="single" w:color="D8D2C6" w:sz="4"/>
+              <w:right w:val="single" w:color="D8D2C6" w:sz="4"/>
+            </w:tcBorders>
+            <w:tcMar>
+              <w:top w:type="dxa" w:w="90"/>
+              <w:left w:type="dxa" w:w="130"/>
+              <w:bottom w:type="dxa" w:w="90"/>
+              <w:right w:type="dxa" w:w="130"/>
+            </w:tcMar>
+          </w:tcPr>
+          <w:p>
+            <w:pPr>
+              <w:spacing w:after="0" w:before="0"/>
+            </w:pPr>
+            <w:r>
+              <w:rPr>
+                <w:rFonts w:ascii="Noto Serif JP" w:cs="Noto Serif JP" w:eastAsia="Noto Serif JP" w:hAnsi="Noto Serif JP"/>
+                <w:b w:val="false"/>
+                <w:bCs w:val="false"/>
+                <w:color w:val="1A1A1A"/>
+                <w:sz w:val="20"/>
+                <w:szCs w:val="20"/>
+              </w:rPr>
+              <w:t xml:space="preserve">余白を残し、誠実に。</w:t>
+            </w:r>
+          </w:p>
+        </w:tc>
+        <w:tc>
+          <w:tcPr>
+            <w:tcW w:type="dxa" w:w="6300"/>
+            <w:tcBorders>
+              <w:top w:val="single" w:color="D8D2C6" w:sz="4"/>
+              <w:left w:val="single" w:color="D8D2C6" w:sz="4"/>
+              <w:bottom w:val="single" w:color="D8D2C6" w:sz="4"/>
+              <w:right w:val="single" w:color="D8D2C6" w:sz="4"/>
+            </w:tcBorders>
+            <w:tcMar>
+              <w:top w:type="dxa" w:w="90"/>
+              <w:left w:type="dxa" w:w="130"/>
+              <w:bottom w:type="dxa" w:w="90"/>
+              <w:right w:type="dxa" w:w="130"/>
+            </w:tcMar>
+          </w:tcPr>
+          <w:p>
+            <w:pPr>
+              <w:spacing w:after="0" w:before="0"/>
+            </w:pPr>
+            <w:r>
+              <w:rPr>
+                <w:rFonts w:ascii="Noto Serif JP" w:cs="Noto Serif JP" w:eastAsia="Noto Serif JP" w:hAnsi="Noto Serif JP"/>
+                <w:b w:val="false"/>
+                <w:bCs w:val="false"/>
+                <w:color w:val="1A1A1A"/>
+                <w:sz w:val="20"/>
+                <w:szCs w:val="20"/>
+              </w:rPr>
+              <w:t xml:space="preserve">Leave space. Stay sincere.</w:t>
+            </w:r>
+          </w:p>
+        </w:tc>
+      </w:tr>
+    </w:tbl>
     <w:p>
       <w:pPr>
         <w:spacing w:after="60" w:before="60"/>

</xml_diff>